<commit_message>
docs(architecture): restructure sections, add per-env data classification, render diagrams as images
- Executive Summary: remove the Deployment Architecture and Key Technology Stack blocks (covered in sections 5 and 6)
- Move the layered architecture diagram into 1.1 (under the first paragraph); 1.2 keeps its layer descriptions
- Swap sections: 2 = Logical Component Architecture, 3 = System Context (subsections renumbered)
- Section 4: remove the search-query SQL block; remove 4.4 Schema Highlights and 4.6 Data Retention (Data Loading renumbered to 4.4)
- 6.1: add a Data classification column to the environment table and the deployment diagram (dev synthetic, test masked/obfuscated, preprod production data for bankers with RSA on, prod production data with RSA on)
- Render all architecture diagrams as PNG images so the document renders in the on-prem Azure DevOps wiki (which does not support Mermaid)
</commit_message>
<xml_diff>
--- a/docs/latest/architecture.docx
+++ b/docs/latest/architecture.docx
@@ -441,195 +441,6 @@
     </w:p>
     <w:p>
       <w:pPr>
-        <w:spacing w:after="80" w:before="40"/>
-      </w:pPr>
-      <w:r>
-        <w:rPr>
-          <w:b/>
-          <w:bCs/>
-        </w:rPr>
-        <w:t xml:space="preserve">Deployment Architecture:</w:t>
-      </w:r>
-    </w:p>
-    <w:p>
-      <w:pPr>
-        <w:pStyle w:val="ListParagraph"/>
-        <w:numPr>
-          <w:ilvl w:val="0"/>
-          <w:numId w:val="2"/>
-        </w:numPr>
-        <w:spacing w:after="20" w:before="0"/>
-      </w:pPr>
-      <w:r>
-        <w:t xml:space="preserve">Infrastructure: On-premise Windows Server 2019+ hosts</w:t>
-      </w:r>
-    </w:p>
-    <w:p>
-      <w:pPr>
-        <w:pStyle w:val="ListParagraph"/>
-        <w:numPr>
-          <w:ilvl w:val="0"/>
-          <w:numId w:val="2"/>
-        </w:numPr>
-        <w:spacing w:after="20" w:before="0"/>
-      </w:pPr>
-      <w:r>
-        <w:t xml:space="preserve">Database: Microsoft SQL Server 2019+ (Always On Availability Groups in production)</w:t>
-      </w:r>
-    </w:p>
-    <w:p>
-      <w:pPr>
-        <w:pStyle w:val="ListParagraph"/>
-        <w:numPr>
-          <w:ilvl w:val="0"/>
-          <w:numId w:val="2"/>
-        </w:numPr>
-        <w:spacing w:after="20" w:before="0"/>
-      </w:pPr>
-      <w:r>
-        <w:t xml:space="preserve">Reverse Proxy: IIS on Windows Server for TLS 1.3 termination and load balancing</w:t>
-      </w:r>
-    </w:p>
-    <w:p>
-      <w:pPr>
-        <w:pStyle w:val="ListParagraph"/>
-        <w:numPr>
-          <w:ilvl w:val="0"/>
-          <w:numId w:val="2"/>
-        </w:numPr>
-        <w:spacing w:after="20" w:before="0"/>
-      </w:pPr>
-      <w:r>
-        <w:t xml:space="preserve">Authentication: RSA SAML 2.0 SSO integration (preprod and production)</w:t>
-      </w:r>
-    </w:p>
-    <w:p>
-      <w:pPr>
-        <w:pStyle w:val="ListParagraph"/>
-        <w:numPr>
-          <w:ilvl w:val="0"/>
-          <w:numId w:val="2"/>
-        </w:numPr>
-        <w:spacing w:after="20" w:before="0"/>
-      </w:pPr>
-      <w:r>
-        <w:t xml:space="preserve">Environments: Development, Test, Pre-production, Production</w:t>
-      </w:r>
-    </w:p>
-    <w:p>
-      <w:pPr>
-        <w:pStyle w:val="ListParagraph"/>
-        <w:numPr>
-          <w:ilvl w:val="0"/>
-          <w:numId w:val="2"/>
-        </w:numPr>
-        <w:spacing w:after="20" w:before="0"/>
-      </w:pPr>
-      <w:r>
-        <w:t xml:space="preserve">Data Pipeline: SOR to Vault to SPOT to ClientIQ application database (initial bulk load plus daily delta updates)</w:t>
-      </w:r>
-    </w:p>
-    <w:p>
-      <w:pPr>
-        <w:spacing w:after="60"/>
-      </w:pPr>
-    </w:p>
-    <w:p>
-      <w:pPr>
-        <w:spacing w:after="80" w:before="40"/>
-      </w:pPr>
-      <w:r>
-        <w:rPr>
-          <w:b/>
-          <w:bCs/>
-        </w:rPr>
-        <w:t xml:space="preserve">Key Technology Stack:</w:t>
-      </w:r>
-    </w:p>
-    <w:p>
-      <w:pPr>
-        <w:pStyle w:val="ListParagraph"/>
-        <w:numPr>
-          <w:ilvl w:val="0"/>
-          <w:numId w:val="2"/>
-        </w:numPr>
-        <w:spacing w:after="20" w:before="0"/>
-      </w:pPr>
-      <w:r>
-        <w:t xml:space="preserve">Frontend: React 18 + TypeScript + Material-UI</w:t>
-      </w:r>
-    </w:p>
-    <w:p>
-      <w:pPr>
-        <w:pStyle w:val="ListParagraph"/>
-        <w:numPr>
-          <w:ilvl w:val="0"/>
-          <w:numId w:val="2"/>
-        </w:numPr>
-        <w:spacing w:after="20" w:before="0"/>
-      </w:pPr>
-      <w:r>
-        <w:t xml:space="preserve">Backend: Express.js + Node.js hosted on Windows Server</w:t>
-      </w:r>
-    </w:p>
-    <w:p>
-      <w:pPr>
-        <w:pStyle w:val="ListParagraph"/>
-        <w:numPr>
-          <w:ilvl w:val="0"/>
-          <w:numId w:val="2"/>
-        </w:numPr>
-        <w:spacing w:after="20" w:before="0"/>
-      </w:pPr>
-      <w:r>
-        <w:t xml:space="preserve">Database: Microsoft SQL Server (case-insensitive search over the unified </w:t>
-      </w:r>
-      <w:r>
-        <w:rPr>
-          <w:rFonts w:ascii="Consolas" w:cs="Consolas" w:eastAsia="Consolas" w:hAnsi="Consolas"/>
-          <w:sz w:val="20"/>
-          <w:szCs w:val="20"/>
-          <w:shd w:fill="EEF0F2" w:val="clear"/>
-        </w:rPr>
-        <w:t xml:space="preserve">full_name</w:t>
-      </w:r>
-      <w:r>
-        <w:t xml:space="preserve"> column)</w:t>
-      </w:r>
-    </w:p>
-    <w:p>
-      <w:pPr>
-        <w:pStyle w:val="ListParagraph"/>
-        <w:numPr>
-          <w:ilvl w:val="0"/>
-          <w:numId w:val="2"/>
-        </w:numPr>
-        <w:spacing w:after="20" w:before="0"/>
-      </w:pPr>
-      <w:r>
-        <w:t xml:space="preserve">Session Management: SQL Server session store</w:t>
-      </w:r>
-    </w:p>
-    <w:p>
-      <w:pPr>
-        <w:pStyle w:val="ListParagraph"/>
-        <w:numPr>
-          <w:ilvl w:val="0"/>
-          <w:numId w:val="2"/>
-        </w:numPr>
-        <w:spacing w:after="20" w:before="0"/>
-      </w:pPr>
-      <w:r>
-        <w:t xml:space="preserve">Authentication: RSA Identity Provider via SAML 2.0</w:t>
-      </w:r>
-    </w:p>
-    <w:p>
-      <w:pPr>
-        <w:spacing w:after="60"/>
-      </w:pPr>
-    </w:p>
-    <w:p>
-      <w:pPr>
         <w:pBdr>
           <w:bottom w:val="single" w:color="333333" w:sz="6" w:space="1"/>
         </w:pBdr>
@@ -663,221 +474,6 @@
     <w:p>
       <w:pPr>
         <w:spacing w:after="80" w:before="40"/>
-      </w:pPr>
-      <w:r>
-        <w:rPr>
-          <w:b/>
-          <w:bCs/>
-        </w:rPr>
-        <w:t xml:space="preserve">Core Capabilities:</w:t>
-      </w:r>
-    </w:p>
-    <w:p>
-      <w:pPr>
-        <w:pStyle w:val="ListParagraph"/>
-        <w:numPr>
-          <w:ilvl w:val="0"/>
-          <w:numId w:val="2"/>
-        </w:numPr>
-        <w:spacing w:after="20" w:before="0"/>
-      </w:pPr>
-      <w:r>
-        <w:rPr>
-          <w:b/>
-          <w:bCs/>
-        </w:rPr>
-        <w:t xml:space="preserve">Customer Intelligence:</w:t>
-      </w:r>
-      <w:r>
-        <w:t xml:space="preserve"> Unified customer profiles with household relationships, account aggregation, and transaction history</w:t>
-      </w:r>
-    </w:p>
-    <w:p>
-      <w:pPr>
-        <w:pStyle w:val="ListParagraph"/>
-        <w:numPr>
-          <w:ilvl w:val="0"/>
-          <w:numId w:val="2"/>
-        </w:numPr>
-        <w:spacing w:after="20" w:before="0"/>
-      </w:pPr>
-      <w:r>
-        <w:rPr>
-          <w:b/>
-          <w:bCs/>
-        </w:rPr>
-        <w:t xml:space="preserve">Customer Data Management:</w:t>
-      </w:r>
-      <w:r>
-        <w:t xml:space="preserve"> Customer information viewing with support for individual, business, and trust customer types</w:t>
-      </w:r>
-    </w:p>
-    <w:p>
-      <w:pPr>
-        <w:pStyle w:val="ListParagraph"/>
-        <w:numPr>
-          <w:ilvl w:val="0"/>
-          <w:numId w:val="2"/>
-        </w:numPr>
-        <w:spacing w:after="20" w:before="0"/>
-      </w:pPr>
-      <w:r>
-        <w:rPr>
-          <w:b/>
-          <w:bCs/>
-        </w:rPr>
-        <w:t xml:space="preserve">Account Management:</w:t>
-      </w:r>
-      <w:r>
-        <w:t xml:space="preserve"> Account viewing with multi-owner support, debit card information, and transaction history</w:t>
-      </w:r>
-    </w:p>
-    <w:p>
-      <w:pPr>
-        <w:pStyle w:val="ListParagraph"/>
-        <w:numPr>
-          <w:ilvl w:val="0"/>
-          <w:numId w:val="2"/>
-        </w:numPr>
-        <w:spacing w:after="20" w:before="0"/>
-      </w:pPr>
-      <w:r>
-        <w:rPr>
-          <w:b/>
-          <w:bCs/>
-        </w:rPr>
-        <w:t xml:space="preserve">Search and Discovery:</w:t>
-      </w:r>
-      <w:r>
-        <w:t xml:space="preserve"> Fast customer lookup by name, tax id, or core-banking identifier, with relevance indicators</w:t>
-      </w:r>
-    </w:p>
-    <w:p>
-      <w:pPr>
-        <w:pStyle w:val="ListParagraph"/>
-        <w:numPr>
-          <w:ilvl w:val="0"/>
-          <w:numId w:val="2"/>
-        </w:numPr>
-        <w:spacing w:after="20" w:before="0"/>
-      </w:pPr>
-      <w:r>
-        <w:rPr>
-          <w:b/>
-          <w:bCs/>
-        </w:rPr>
-        <w:t xml:space="preserve">Customer Notes:</w:t>
-      </w:r>
-      <w:r>
-        <w:t xml:space="preserve"> Full CRUD operations on customer notes with versioning and audit trails</w:t>
-      </w:r>
-    </w:p>
-    <w:p>
-      <w:pPr>
-        <w:spacing w:after="60"/>
-      </w:pPr>
-    </w:p>
-    <w:p>
-      <w:pPr>
-        <w:spacing w:after="80" w:before="40"/>
-      </w:pPr>
-      <w:r>
-        <w:rPr>
-          <w:b/>
-          <w:bCs/>
-        </w:rPr>
-        <w:t xml:space="preserve">Technical Foundation:</w:t>
-      </w:r>
-    </w:p>
-    <w:p>
-      <w:pPr>
-        <w:pStyle w:val="ListParagraph"/>
-        <w:numPr>
-          <w:ilvl w:val="0"/>
-          <w:numId w:val="2"/>
-        </w:numPr>
-        <w:spacing w:after="20" w:before="0"/>
-      </w:pPr>
-      <w:r>
-        <w:t xml:space="preserve">React 18 + TypeScript single-page application</w:t>
-      </w:r>
-    </w:p>
-    <w:p>
-      <w:pPr>
-        <w:pStyle w:val="ListParagraph"/>
-        <w:numPr>
-          <w:ilvl w:val="0"/>
-          <w:numId w:val="2"/>
-        </w:numPr>
-        <w:spacing w:after="20" w:before="0"/>
-      </w:pPr>
-      <w:r>
-        <w:t xml:space="preserve">Express.js REST API layer hosted on Node.js (Windows Server)</w:t>
-      </w:r>
-    </w:p>
-    <w:p>
-      <w:pPr>
-        <w:pStyle w:val="ListParagraph"/>
-        <w:numPr>
-          <w:ilvl w:val="0"/>
-          <w:numId w:val="2"/>
-        </w:numPr>
-        <w:spacing w:after="20" w:before="0"/>
-      </w:pPr>
-      <w:r>
-        <w:t xml:space="preserve">Microsoft SQL Server 2019+ with Always On Availability Groups (production)</w:t>
-      </w:r>
-    </w:p>
-    <w:p>
-      <w:pPr>
-        <w:pStyle w:val="ListParagraph"/>
-        <w:numPr>
-          <w:ilvl w:val="0"/>
-          <w:numId w:val="2"/>
-        </w:numPr>
-        <w:spacing w:after="20" w:before="0"/>
-      </w:pPr>
-      <w:r>
-        <w:t xml:space="preserve">RSA SAML 2.0 SSO authentication (preprod and production)</w:t>
-      </w:r>
-    </w:p>
-    <w:p>
-      <w:pPr>
-        <w:pStyle w:val="ListParagraph"/>
-        <w:numPr>
-          <w:ilvl w:val="0"/>
-          <w:numId w:val="2"/>
-        </w:numPr>
-        <w:spacing w:after="20" w:before="0"/>
-      </w:pPr>
-      <w:r>
-        <w:t xml:space="preserve">IIS reverse proxy for TLS termination and load balancing</w:t>
-      </w:r>
-    </w:p>
-    <w:p>
-      <w:pPr>
-        <w:spacing w:after="60"/>
-      </w:pPr>
-    </w:p>
-    <w:p>
-      <w:pPr>
-        <w:pStyle w:val="Heading3"/>
-      </w:pPr>
-      <w:r>
-        <w:t xml:space="preserve">1.2 High Level Architecture Overview</w:t>
-      </w:r>
-    </w:p>
-    <w:p>
-      <w:pPr>
-        <w:spacing w:after="80" w:before="40"/>
-      </w:pPr>
-      <w:r>
-        <w:t xml:space="preserve">The solution is built as a responsive web application that supports Single Sign-On (SSO) for secure access. The application architecture is organized into logical layers, fronted by IIS and backed by SQL Server, with data delivered from the FMB core-banking pipeline.</w:t>
-      </w:r>
-    </w:p>
-    <w:p>
-      <w:pPr>
-        <w:spacing w:after="80" w:before="40"/>
         <w:jc w:val="center"/>
       </w:pPr>
       <w:r>
@@ -885,7 +481,7 @@
           <wp:inline distT="0" distB="0" distL="0" distR="0">
             <wp:extent cx="6286500" cy="4143375"/>
             <wp:effectExtent t="0" r="0" b="0" l="0"/>
-            <wp:docPr id="1" name="img-images-architecture-layered-png" descr="ClientIQ layered architecture. Bands top to bottom: Web / Edge (IIS on Windows Server, TLS 1.3 termination and reverse proxy to Node on port 5000), Presentation (React 18 + MUI SPA, Wouter routing, TanStack Query), Application and Business (middleware chain, REST API, domain services), Data Access (row-to-DTO adapters, SqlServerSearchProvider, parameterized mssql), and Data (the SOR to VAULT to SPOT to ClientIQ SQL Server daily data-load flow). The RSA SecurID / Active Directory identity provider connects to the Application tier, and an Observability element spans the Data Access and Data tiers." title="ClientIQ layered architecture. Bands top to bottom: Web / Edge (IIS on Windows Server, TLS 1.3 termination and reverse proxy to Node on port 5000), Presentation (React 18 + MUI SPA, Wouter routing, TanStack Query), Application and Business (middleware chain, REST API, domain services), Data Access (row-to-DTO adapters, SqlServerSearchProvider, parameterized mssql), and Data (the SOR to VAULT to SPOT to ClientIQ SQL Server daily data-load flow). The RSA SecurID / Active Directory identity provider connects to the Application tier, and an Observability element spans the Data Access and Data tiers."/>
+            <wp:docPr id="1" name="img-images-architecture-layered-png" descr="ClientIQ layered architecture. Bands top to bottom: Web / Edge (IIS on Windows Server, TLS 1.3 termination and reverse proxy to Node on port 5000), Presentation (React 18 + MUI SPA, Wouter routing, TanStack Query), Application and Business (middleware chain, REST API, domain services), Data Access (row-to-DTO adapters, SqlServerSearchProvider, parameterized mssql), and Data (the SOR to VAULT to SPOT to ClientIQ SQL Server daily data-load flow). The RSA SecurID / Active Directory identity provider connects to the Application tier, and an Observability element (audit tables, application logs, health checks, alerting) spans the Data Access and Data tiers." title="ClientIQ layered architecture. Bands top to bottom: Web / Edge (IIS on Windows Server, TLS 1.3 termination and reverse proxy to Node on port 5000), Presentation (React 18 + MUI SPA, Wouter routing, TanStack Query), Application and Business (middleware chain, REST API, domain services), Data Access (row-to-DTO adapters, SqlServerSearchProvider, parameterized mssql), and Data (the SOR to VAULT to SPOT to ClientIQ SQL Server daily data-load flow). The RSA SecurID / Active Directory identity provider connects to the Application tier, and an Observability element (audit tables, application logs, health checks, alerting) spans the Data Access and Data tiers."/>
             <wp:cNvGraphicFramePr>
               <a:graphicFrameLocks xmlns:a="http://schemas.openxmlformats.org/drawingml/2006/main" noChangeAspect="1"/>
             </wp:cNvGraphicFramePr>
@@ -926,7 +522,11 @@
         <w:spacing w:after="80" w:before="40"/>
       </w:pPr>
       <w:r>
-        <w:t xml:space="preserve">The application architecture is organized into multiple logical layers:</w:t>
+        <w:rPr>
+          <w:b/>
+          <w:bCs/>
+        </w:rPr>
+        <w:t xml:space="preserve">Core Capabilities:</w:t>
       </w:r>
     </w:p>
     <w:p>
@@ -943,10 +543,10 @@
           <w:b/>
           <w:bCs/>
         </w:rPr>
-        <w:t xml:space="preserve">Interface Layer:</w:t>
-      </w:r>
-      <w:r>
-        <w:t xml:space="preserve"> Web user interface supporting responsive design and secure client interactions.</w:t>
+        <w:t xml:space="preserve">Customer Intelligence:</w:t>
+      </w:r>
+      <w:r>
+        <w:t xml:space="preserve"> Unified customer profiles with household relationships, account aggregation, and transaction history</w:t>
       </w:r>
     </w:p>
     <w:p>
@@ -963,10 +563,10 @@
           <w:b/>
           <w:bCs/>
         </w:rPr>
-        <w:t xml:space="preserve">Application Services Layer:</w:t>
-      </w:r>
-      <w:r>
-        <w:t xml:space="preserve"> Implements business logic for client data presentation, entitlement enforcement, and user management.</w:t>
+        <w:t xml:space="preserve">Customer Data Management:</w:t>
+      </w:r>
+      <w:r>
+        <w:t xml:space="preserve"> Customer information viewing with support for individual, business, and trust customer types</w:t>
       </w:r>
     </w:p>
     <w:p>
@@ -983,10 +583,10 @@
           <w:b/>
           <w:bCs/>
         </w:rPr>
-        <w:t xml:space="preserve">Integration Layer:</w:t>
-      </w:r>
-      <w:r>
-        <w:t xml:space="preserve"> Provides secure API and service connectivity with JHA (Jack Henry) core banking and supporting systems.</w:t>
+        <w:t xml:space="preserve">Account Management:</w:t>
+      </w:r>
+      <w:r>
+        <w:t xml:space="preserve"> Account viewing with multi-owner support, debit card information, and transaction history</w:t>
       </w:r>
     </w:p>
     <w:p>
@@ -1003,23 +603,10 @@
           <w:b/>
           <w:bCs/>
         </w:rPr>
-        <w:t xml:space="preserve">Data Layer:</w:t>
-      </w:r>
-      <w:r>
-        <w:t xml:space="preserve"> Consumes curated data from Vault and SPOT sources and supports data engineering functions for performance, enrichment, and governance.</w:t>
-      </w:r>
-    </w:p>
-    <w:p>
-      <w:pPr>
-        <w:spacing w:after="60"/>
-      </w:pPr>
-    </w:p>
-    <w:p>
-      <w:pPr>
-        <w:spacing w:after="80" w:before="40"/>
-      </w:pPr>
-      <w:r>
-        <w:t xml:space="preserve">The architecture includes foundational components for security, reliability, and operational excellence:</w:t>
+        <w:t xml:space="preserve">Search and Discovery:</w:t>
+      </w:r>
+      <w:r>
+        <w:t xml:space="preserve"> Fast customer lookup by name, tax id, or core-banking identifier, with relevance indicators</w:t>
       </w:r>
     </w:p>
     <w:p>
@@ -1036,10 +623,27 @@
           <w:b/>
           <w:bCs/>
         </w:rPr>
-        <w:t xml:space="preserve">Security:</w:t>
-      </w:r>
-      <w:r>
-        <w:t xml:space="preserve"> SSO integration, TLS 1.3 encryption, and user entitlements using RBAC and ABAC models.</w:t>
+        <w:t xml:space="preserve">Customer Notes:</w:t>
+      </w:r>
+      <w:r>
+        <w:t xml:space="preserve"> Full CRUD operations on customer notes with versioning and audit trails</w:t>
+      </w:r>
+    </w:p>
+    <w:p>
+      <w:pPr>
+        <w:spacing w:after="60"/>
+      </w:pPr>
+    </w:p>
+    <w:p>
+      <w:pPr>
+        <w:spacing w:after="80" w:before="40"/>
+      </w:pPr>
+      <w:r>
+        <w:rPr>
+          <w:b/>
+          <w:bCs/>
+        </w:rPr>
+        <w:t xml:space="preserve">Technical Foundation:</w:t>
       </w:r>
     </w:p>
     <w:p>
@@ -1052,14 +656,7 @@
         <w:spacing w:after="20" w:before="0"/>
       </w:pPr>
       <w:r>
-        <w:rPr>
-          <w:b/>
-          <w:bCs/>
-        </w:rPr>
-        <w:t xml:space="preserve">Observability:</w:t>
-      </w:r>
-      <w:r>
-        <w:t xml:space="preserve"> Centralized logging, application health checks, and alerting for proactive monitoring.</w:t>
+        <w:t xml:space="preserve">React 18 + TypeScript single-page application</w:t>
       </w:r>
     </w:p>
     <w:p>
@@ -1072,6 +669,212 @@
         <w:spacing w:after="20" w:before="0"/>
       </w:pPr>
       <w:r>
+        <w:t xml:space="preserve">Express.js REST API layer hosted on Node.js (Windows Server)</w:t>
+      </w:r>
+    </w:p>
+    <w:p>
+      <w:pPr>
+        <w:pStyle w:val="ListParagraph"/>
+        <w:numPr>
+          <w:ilvl w:val="0"/>
+          <w:numId w:val="2"/>
+        </w:numPr>
+        <w:spacing w:after="20" w:before="0"/>
+      </w:pPr>
+      <w:r>
+        <w:t xml:space="preserve">Microsoft SQL Server 2019+ with Always On Availability Groups (production)</w:t>
+      </w:r>
+    </w:p>
+    <w:p>
+      <w:pPr>
+        <w:pStyle w:val="ListParagraph"/>
+        <w:numPr>
+          <w:ilvl w:val="0"/>
+          <w:numId w:val="2"/>
+        </w:numPr>
+        <w:spacing w:after="20" w:before="0"/>
+      </w:pPr>
+      <w:r>
+        <w:t xml:space="preserve">RSA SAML 2.0 SSO authentication (preprod and production)</w:t>
+      </w:r>
+    </w:p>
+    <w:p>
+      <w:pPr>
+        <w:pStyle w:val="ListParagraph"/>
+        <w:numPr>
+          <w:ilvl w:val="0"/>
+          <w:numId w:val="2"/>
+        </w:numPr>
+        <w:spacing w:after="20" w:before="0"/>
+      </w:pPr>
+      <w:r>
+        <w:t xml:space="preserve">IIS reverse proxy for TLS termination and load balancing</w:t>
+      </w:r>
+    </w:p>
+    <w:p>
+      <w:pPr>
+        <w:spacing w:after="60"/>
+      </w:pPr>
+    </w:p>
+    <w:p>
+      <w:pPr>
+        <w:pStyle w:val="Heading3"/>
+      </w:pPr>
+      <w:r>
+        <w:t xml:space="preserve">1.2 High Level Architecture Overview</w:t>
+      </w:r>
+    </w:p>
+    <w:p>
+      <w:pPr>
+        <w:spacing w:after="80" w:before="40"/>
+      </w:pPr>
+      <w:r>
+        <w:t xml:space="preserve">The solution is built as a responsive web application that supports Single Sign-On (SSO) for secure access. The application architecture is organized into multiple logical layers, fronted by IIS and backed by SQL Server, with data delivered from the FMB core-banking pipeline:</w:t>
+      </w:r>
+    </w:p>
+    <w:p>
+      <w:pPr>
+        <w:pStyle w:val="ListParagraph"/>
+        <w:numPr>
+          <w:ilvl w:val="0"/>
+          <w:numId w:val="2"/>
+        </w:numPr>
+        <w:spacing w:after="20" w:before="0"/>
+      </w:pPr>
+      <w:r>
+        <w:rPr>
+          <w:b/>
+          <w:bCs/>
+        </w:rPr>
+        <w:t xml:space="preserve">Interface Layer:</w:t>
+      </w:r>
+      <w:r>
+        <w:t xml:space="preserve"> Web user interface supporting responsive design and secure client interactions.</w:t>
+      </w:r>
+    </w:p>
+    <w:p>
+      <w:pPr>
+        <w:pStyle w:val="ListParagraph"/>
+        <w:numPr>
+          <w:ilvl w:val="0"/>
+          <w:numId w:val="2"/>
+        </w:numPr>
+        <w:spacing w:after="20" w:before="0"/>
+      </w:pPr>
+      <w:r>
+        <w:rPr>
+          <w:b/>
+          <w:bCs/>
+        </w:rPr>
+        <w:t xml:space="preserve">Application Services Layer:</w:t>
+      </w:r>
+      <w:r>
+        <w:t xml:space="preserve"> Implements business logic for client data presentation, entitlement enforcement, and user management.</w:t>
+      </w:r>
+    </w:p>
+    <w:p>
+      <w:pPr>
+        <w:pStyle w:val="ListParagraph"/>
+        <w:numPr>
+          <w:ilvl w:val="0"/>
+          <w:numId w:val="2"/>
+        </w:numPr>
+        <w:spacing w:after="20" w:before="0"/>
+      </w:pPr>
+      <w:r>
+        <w:rPr>
+          <w:b/>
+          <w:bCs/>
+        </w:rPr>
+        <w:t xml:space="preserve">Integration Layer:</w:t>
+      </w:r>
+      <w:r>
+        <w:t xml:space="preserve"> Provides secure API and service connectivity with JHA (Jack Henry) core banking and supporting systems.</w:t>
+      </w:r>
+    </w:p>
+    <w:p>
+      <w:pPr>
+        <w:pStyle w:val="ListParagraph"/>
+        <w:numPr>
+          <w:ilvl w:val="0"/>
+          <w:numId w:val="2"/>
+        </w:numPr>
+        <w:spacing w:after="20" w:before="0"/>
+      </w:pPr>
+      <w:r>
+        <w:rPr>
+          <w:b/>
+          <w:bCs/>
+        </w:rPr>
+        <w:t xml:space="preserve">Data Layer:</w:t>
+      </w:r>
+      <w:r>
+        <w:t xml:space="preserve"> Consumes curated data from Vault and SPOT sources and supports data engineering functions for performance, enrichment, and governance.</w:t>
+      </w:r>
+    </w:p>
+    <w:p>
+      <w:pPr>
+        <w:spacing w:after="60"/>
+      </w:pPr>
+    </w:p>
+    <w:p>
+      <w:pPr>
+        <w:spacing w:after="80" w:before="40"/>
+      </w:pPr>
+      <w:r>
+        <w:t xml:space="preserve">The architecture includes foundational components for security, reliability, and operational excellence:</w:t>
+      </w:r>
+    </w:p>
+    <w:p>
+      <w:pPr>
+        <w:pStyle w:val="ListParagraph"/>
+        <w:numPr>
+          <w:ilvl w:val="0"/>
+          <w:numId w:val="2"/>
+        </w:numPr>
+        <w:spacing w:after="20" w:before="0"/>
+      </w:pPr>
+      <w:r>
+        <w:rPr>
+          <w:b/>
+          <w:bCs/>
+        </w:rPr>
+        <w:t xml:space="preserve">Security:</w:t>
+      </w:r>
+      <w:r>
+        <w:t xml:space="preserve"> SSO integration, TLS 1.3 encryption, and user entitlements using RBAC and ABAC models.</w:t>
+      </w:r>
+    </w:p>
+    <w:p>
+      <w:pPr>
+        <w:pStyle w:val="ListParagraph"/>
+        <w:numPr>
+          <w:ilvl w:val="0"/>
+          <w:numId w:val="2"/>
+        </w:numPr>
+        <w:spacing w:after="20" w:before="0"/>
+      </w:pPr>
+      <w:r>
+        <w:rPr>
+          <w:b/>
+          <w:bCs/>
+        </w:rPr>
+        <w:t xml:space="preserve">Observability:</w:t>
+      </w:r>
+      <w:r>
+        <w:t xml:space="preserve"> Centralized logging, application health checks, and alerting for proactive monitoring.</w:t>
+      </w:r>
+    </w:p>
+    <w:p>
+      <w:pPr>
+        <w:pStyle w:val="ListParagraph"/>
+        <w:numPr>
+          <w:ilvl w:val="0"/>
+          <w:numId w:val="2"/>
+        </w:numPr>
+        <w:spacing w:after="20" w:before="0"/>
+      </w:pPr>
+      <w:r>
         <w:rPr>
           <w:b/>
           <w:bCs/>
@@ -1147,16 +950,7 @@
         <w:t xml:space="preserve">API Layer:</w:t>
       </w:r>
       <w:r>
-        <w:t xml:space="preserve"> RESTful endpoints (unversioned today; URL versioning is a roadmap item, see </w:t>
-      </w:r>
-      <w:r>
-        <w:rPr>
-          <w:rStyle w:val="Hyperlink"/>
-        </w:rPr>
-        <w:t xml:space="preserve">§5.2</w:t>
-      </w:r>
-      <w:r>
-        <w:t xml:space="preserve">)</w:t>
+        <w:t xml:space="preserve"> RESTful endpoints (unversioned today; URL versioning is a roadmap item, see §5.2)</w:t>
       </w:r>
     </w:p>
     <w:p>
@@ -2643,7 +2437,7 @@
         <w:pStyle w:val="Heading2"/>
       </w:pPr>
       <w:r>
-        <w:t xml:space="preserve">2. System Context</w:t>
+        <w:t xml:space="preserve">2. Logical Component Architecture</w:t>
       </w:r>
     </w:p>
     <w:p>
@@ -2651,7 +2445,7 @@
         <w:pStyle w:val="Heading3"/>
       </w:pPr>
       <w:r>
-        <w:t xml:space="preserve">2.1 System Context Diagram</w:t>
+        <w:t xml:space="preserve">2.1 Component Structure and Responsibilities</w:t>
       </w:r>
     </w:p>
     <w:p>
@@ -2659,20 +2453,20 @@
         <w:spacing w:after="80" w:before="40"/>
       </w:pPr>
       <w:r>
-        <w:t xml:space="preserve">The ClientIQ system operates within FMB's on-premise datacenter environment. FMB staff reach the application over HTTPS on the corporate network; the application integrates with the core-banking data pipeline and the RSA identity provider.</w:t>
-      </w:r>
-    </w:p>
-    <w:p>
-      <w:pPr>
-        <w:spacing w:after="100" w:before="80"/>
+        <w:t xml:space="preserve">The platform follows a layered architecture pattern with clear separation of concerns. Each layer exposes a narrow contract to the layer above it, and the data-access layer is the only tier that talks to SQL Server.</w:t>
+      </w:r>
+    </w:p>
+    <w:p>
+      <w:pPr>
+        <w:spacing w:after="80" w:before="40"/>
         <w:jc w:val="center"/>
       </w:pPr>
       <w:r>
         <w:drawing>
           <wp:inline distT="0" distB="0" distL="0" distR="0">
-            <wp:extent cx="5153025" cy="8001000"/>
+            <wp:extent cx="6286500" cy="7429500"/>
             <wp:effectExtent t="0" r="0" b="0" l="0"/>
-            <wp:docPr id="1" name="diagram-architecture-1" descr="Mermaid diagram" title="Diagram"/>
+            <wp:docPr id="1" name="img-images-arch-component-png" descr="ClientIQ component structure. Presentation Layer (Customer Dashboard, Household Management, Account Summary, Transaction History, Notes, Customer Overview; React 18, TypeScript, Material-UI, TanStack Query, Wouter, React Hook Form + Zod) over HTTPS/JSON to the API Layer (Express routes with Zod validation, authentication middleware, authorization middleware), to the Business Logic Layer (customer adapter, domain services), to the Data Access Layer (parameterized mssql queries, case-insensitive LIKE search, SQL Server session store), to SQL Server." title="ClientIQ component structure. Presentation Layer (Customer Dashboard, Household Management, Account Summary, Transaction History, Notes, Customer Overview; React 18, TypeScript, Material-UI, TanStack Query, Wouter, React Hook Form + Zod) over HTTPS/JSON to the API Layer (Express routes with Zod validation, authentication middleware, authorization middleware), to the Business Logic Layer (customer adapter, domain services), to the Data Access Layer (parameterized mssql queries, case-insensitive LIKE search, SQL Server session store), to SQL Server."/>
             <wp:cNvGraphicFramePr>
               <a:graphicFrameLocks xmlns:a="http://schemas.openxmlformats.org/drawingml/2006/main" noChangeAspect="1"/>
             </wp:cNvGraphicFramePr>
@@ -2695,7 +2489,7 @@
                   <pic:spPr bwMode="auto">
                     <a:xfrm>
                       <a:off x="0" y="0"/>
-                      <a:ext cx="5153025" cy="8001000"/>
+                      <a:ext cx="6286500" cy="7429500"/>
                     </a:xfrm>
                     <a:prstGeom prst="rect">
                       <a:avLst/>
@@ -2710,10 +2504,159 @@
     </w:p>
     <w:p>
       <w:pPr>
+        <w:spacing w:after="80" w:before="40"/>
+      </w:pPr>
+      <w:r>
+        <w:rPr>
+          <w:b/>
+          <w:bCs/>
+        </w:rPr>
+        <w:t xml:space="preserve">Layer responsibilities:</w:t>
+      </w:r>
+    </w:p>
+    <w:p>
+      <w:pPr>
+        <w:pStyle w:val="ListParagraph"/>
+        <w:numPr>
+          <w:ilvl w:val="0"/>
+          <w:numId w:val="2"/>
+        </w:numPr>
+        <w:spacing w:after="20" w:before="0"/>
+      </w:pPr>
+      <w:r>
+        <w:rPr>
+          <w:b/>
+          <w:bCs/>
+        </w:rPr>
+        <w:t xml:space="preserve">Presentation:</w:t>
+      </w:r>
+      <w:r>
+        <w:t xml:space="preserve"> Customer Dashboard, Household Management, Account Summary, Transaction History, Notes, and Customer Overview screens. Technology: React 18, TypeScript, Material-UI, TanStack React Query (server state), Wouter (routing), React Hook Form + Zod (forms).</w:t>
+      </w:r>
+    </w:p>
+    <w:p>
+      <w:pPr>
+        <w:pStyle w:val="ListParagraph"/>
+        <w:numPr>
+          <w:ilvl w:val="0"/>
+          <w:numId w:val="2"/>
+        </w:numPr>
+        <w:spacing w:after="20" w:before="0"/>
+      </w:pPr>
+      <w:r>
+        <w:rPr>
+          <w:b/>
+          <w:bCs/>
+        </w:rPr>
+        <w:t xml:space="preserve">API:</w:t>
+      </w:r>
+      <w:r>
+        <w:t xml:space="preserve"> Express route definitions, Zod request validation, standardized error handling; SAML authentication middleware (session validation, employee lookup/upsert from SAML assertions); authorization middleware (RBAC checks, ABAC conditional evaluation, privilege-level verification).</w:t>
+      </w:r>
+    </w:p>
+    <w:p>
+      <w:pPr>
+        <w:pStyle w:val="ListParagraph"/>
+        <w:numPr>
+          <w:ilvl w:val="0"/>
+          <w:numId w:val="2"/>
+        </w:numPr>
+        <w:spacing w:after="20" w:before="0"/>
+      </w:pPr>
+      <w:r>
+        <w:rPr>
+          <w:b/>
+          <w:bCs/>
+        </w:rPr>
+        <w:t xml:space="preserve">Business Logic:</w:t>
+      </w:r>
+      <w:r>
+        <w:t xml:space="preserve"> Customer adapter (PII masking, DTO mapping), Account/Household/Transaction/Search services, Permission service (ABAC evaluation, audit logging), Note service (versioning, soft delete).</w:t>
+      </w:r>
+    </w:p>
+    <w:p>
+      <w:pPr>
+        <w:pStyle w:val="ListParagraph"/>
+        <w:numPr>
+          <w:ilvl w:val="0"/>
+          <w:numId w:val="2"/>
+        </w:numPr>
+        <w:spacing w:after="20" w:before="0"/>
+      </w:pPr>
+      <w:r>
+        <w:rPr>
+          <w:b/>
+          <w:bCs/>
+        </w:rPr>
+        <w:t xml:space="preserve">Data Access:</w:t>
+      </w:r>
+      <w:r>
+        <w:t xml:space="preserve"> SQL Server access via the </w:t>
+      </w:r>
+      <w:r>
+        <w:rPr>
+          <w:rFonts w:ascii="Consolas" w:cs="Consolas" w:eastAsia="Consolas" w:hAnsi="Consolas"/>
+          <w:sz w:val="20"/>
+          <w:szCs w:val="20"/>
+          <w:shd w:fill="EEF0F2" w:val="clear"/>
+        </w:rPr>
+        <w:t xml:space="preserve">mssql</w:t>
+      </w:r>
+      <w:r>
+        <w:t xml:space="preserve"> driver with parameterized queries and connection pooling; case-insensitive </w:t>
+      </w:r>
+      <w:r>
+        <w:rPr>
+          <w:rFonts w:ascii="Consolas" w:cs="Consolas" w:eastAsia="Consolas" w:hAnsi="Consolas"/>
+          <w:sz w:val="20"/>
+          <w:szCs w:val="20"/>
+          <w:shd w:fill="EEF0F2" w:val="clear"/>
+        </w:rPr>
+        <w:t xml:space="preserve">LIKE</w:t>
+      </w:r>
+      <w:r>
+        <w:t xml:space="preserve"> search over </w:t>
+      </w:r>
+      <w:r>
+        <w:rPr>
+          <w:rFonts w:ascii="Consolas" w:cs="Consolas" w:eastAsia="Consolas" w:hAnsi="Consolas"/>
+          <w:sz w:val="20"/>
+          <w:szCs w:val="20"/>
+          <w:shd w:fill="EEF0F2" w:val="clear"/>
+        </w:rPr>
+        <w:t xml:space="preserve">full_name</w:t>
+      </w:r>
+      <w:r>
+        <w:t xml:space="preserve">; SQL Server session store with automatic cleanup.</w:t>
+      </w:r>
+    </w:p>
+    <w:p>
+      <w:pPr>
+        <w:spacing w:after="60"/>
+      </w:pPr>
+    </w:p>
+    <w:p>
+      <w:pPr>
+        <w:pBdr>
+          <w:bottom w:val="single" w:color="333333" w:sz="6" w:space="1"/>
+        </w:pBdr>
+        <w:spacing w:after="80" w:before="80"/>
+      </w:pPr>
+    </w:p>
+    <w:p>
+      <w:pPr>
+        <w:pStyle w:val="Heading2"/>
+      </w:pPr>
+      <w:r>
+        <w:t xml:space="preserve">3. System Context</w:t>
+      </w:r>
+    </w:p>
+    <w:p>
+      <w:pPr>
         <w:pStyle w:val="Heading3"/>
       </w:pPr>
       <w:r>
-        <w:t xml:space="preserve">2.2 FMB Data Pipeline Architecture (SOR to Vault to SPOT to App DB)</w:t>
+        <w:t xml:space="preserve">3.1 System Context Diagram</w:t>
       </w:r>
     </w:p>
     <w:p>
@@ -2721,20 +2664,20 @@
         <w:spacing w:after="80" w:before="40"/>
       </w:pPr>
       <w:r>
-        <w:t xml:space="preserve">The application database is populated through a multi-stage pipeline. Source records originate in the FMB System of Record (Jack Henry Symitar and Silverlake core banking, plus Synapse), land in the Vault data warehouse, are curated into SPOT, and are then loaded into the ClientIQ SQL Server database on a daily cadence (initial bulk load followed by daily deltas).</w:t>
-      </w:r>
-    </w:p>
-    <w:p>
-      <w:pPr>
-        <w:spacing w:after="100" w:before="80"/>
+        <w:t xml:space="preserve">The ClientIQ system operates within FMB's on-premise datacenter environment. FMB staff reach the application over HTTPS on the corporate network; the application integrates with the core-banking data pipeline and the RSA identity provider.</w:t>
+      </w:r>
+    </w:p>
+    <w:p>
+      <w:pPr>
+        <w:spacing w:after="80" w:before="40"/>
         <w:jc w:val="center"/>
       </w:pPr>
       <w:r>
         <w:drawing>
           <wp:inline distT="0" distB="0" distL="0" distR="0">
-            <wp:extent cx="5905500" cy="847725"/>
+            <wp:extent cx="5400675" cy="8382000"/>
             <wp:effectExtent t="0" r="0" b="0" l="0"/>
-            <wp:docPr id="1" name="diagram-architecture-2" descr="Mermaid diagram" title="Diagram"/>
+            <wp:docPr id="1" name="img-images-arch-system-context-png" descr="ClientIQ system context. FMB bank employees reach the system over HTTPS 443 on the corporate network / VPN, through the datacenter perimeter (firewall, IDS/IPS, port 443 only, source-IP allowlisting), to the IIS reverse proxy (TLS 1.3 termination), to the application servers (Windows Server, Node.js + Express on port 5000, React SPA), to SQL Server (App DB, session store, audit; Always On AG in production). The FMB SOR (Jack Henry Symitar, Silverlake core banking, Synapse) flows to the FMB Vault data warehouse, to SPOT, and is loaded daily into SQL Server. The RSA Identity Provider (SAML 2.0 SSO) connects to the application servers." title="ClientIQ system context. FMB bank employees reach the system over HTTPS 443 on the corporate network / VPN, through the datacenter perimeter (firewall, IDS/IPS, port 443 only, source-IP allowlisting), to the IIS reverse proxy (TLS 1.3 termination), to the application servers (Windows Server, Node.js + Express on port 5000, React SPA), to SQL Server (App DB, session store, audit; Always On AG in production). The FMB SOR (Jack Henry Symitar, Silverlake core banking, Synapse) flows to the FMB Vault data warehouse, to SPOT, and is loaded daily into SQL Server. The RSA Identity Provider (SAML 2.0 SSO) connects to the application servers."/>
             <wp:cNvGraphicFramePr>
               <a:graphicFrameLocks xmlns:a="http://schemas.openxmlformats.org/drawingml/2006/main" noChangeAspect="1"/>
             </wp:cNvGraphicFramePr>
@@ -2757,7 +2700,7 @@
                   <pic:spPr bwMode="auto">
                     <a:xfrm>
                       <a:off x="0" y="0"/>
-                      <a:ext cx="5905500" cy="847725"/>
+                      <a:ext cx="5400675" cy="8382000"/>
                     </a:xfrm>
                     <a:prstGeom prst="rect">
                       <a:avLst/>
@@ -2772,6 +2715,68 @@
     </w:p>
     <w:p>
       <w:pPr>
+        <w:pStyle w:val="Heading3"/>
+      </w:pPr>
+      <w:r>
+        <w:t xml:space="preserve">3.2 FMB Data Pipeline Architecture (SOR to Vault to SPOT to App DB)</w:t>
+      </w:r>
+    </w:p>
+    <w:p>
+      <w:pPr>
+        <w:spacing w:after="80" w:before="40"/>
+      </w:pPr>
+      <w:r>
+        <w:t xml:space="preserve">The application database is populated through a multi-stage pipeline. Source records originate in the FMB System of Record (Jack Henry Symitar and Silverlake core banking, plus Synapse), land in the Vault data warehouse, are curated into SPOT, and are then loaded into the ClientIQ SQL Server database on a daily cadence (initial bulk load followed by daily deltas).</w:t>
+      </w:r>
+    </w:p>
+    <w:p>
+      <w:pPr>
+        <w:spacing w:after="80" w:before="40"/>
+        <w:jc w:val="center"/>
+      </w:pPr>
+      <w:r>
+        <w:drawing>
+          <wp:inline distT="0" distB="0" distL="0" distR="0">
+            <wp:extent cx="6286500" cy="904875"/>
+            <wp:effectExtent t="0" r="0" b="0" l="0"/>
+            <wp:docPr id="1" name="img-images-arch-data-pipeline-png" descr="ClientIQ data pipeline. Jack Henry (Symitar / Silverlake core banking) and Synapse feed the FMB Vault data warehouse (cleansed), which feeds SPOT (curated views), which performs an initial bulk load plus daily delta into the ClientIQ SQL Server database, which serves the ClientIQ application." title="ClientIQ data pipeline. Jack Henry (Symitar / Silverlake core banking) and Synapse feed the FMB Vault data warehouse (cleansed), which feeds SPOT (curated views), which performs an initial bulk load plus daily delta into the ClientIQ SQL Server database, which serves the ClientIQ application."/>
+            <wp:cNvGraphicFramePr>
+              <a:graphicFrameLocks xmlns:a="http://schemas.openxmlformats.org/drawingml/2006/main" noChangeAspect="1"/>
+            </wp:cNvGraphicFramePr>
+            <a:graphic xmlns:a="http://schemas.openxmlformats.org/drawingml/2006/main">
+              <a:graphicData uri="http://schemas.openxmlformats.org/drawingml/2006/picture">
+                <pic:pic xmlns:pic="http://schemas.openxmlformats.org/drawingml/2006/picture">
+                  <pic:nvPicPr>
+                    <pic:cNvPr id="0" name="" descr=""/>
+                    <pic:cNvPicPr>
+                      <a:picLocks noChangeAspect="1" noChangeArrowheads="1"/>
+                    </pic:cNvPicPr>
+                  </pic:nvPicPr>
+                  <pic:blipFill>
+                    <a:blip r:embed="rId12" cstate="none"/>
+                    <a:srcRect/>
+                    <a:stretch>
+                      <a:fillRect/>
+                    </a:stretch>
+                  </pic:blipFill>
+                  <pic:spPr bwMode="auto">
+                    <a:xfrm>
+                      <a:off x="0" y="0"/>
+                      <a:ext cx="6286500" cy="904875"/>
+                    </a:xfrm>
+                    <a:prstGeom prst="rect">
+                      <a:avLst/>
+                    </a:prstGeom>
+                  </pic:spPr>
+                </pic:pic>
+              </a:graphicData>
+            </a:graphic>
+          </wp:inline>
+        </w:drawing>
+      </w:r>
+    </w:p>
+    <w:p>
+      <w:pPr>
         <w:spacing w:after="80" w:before="40"/>
       </w:pPr>
       <w:r>
@@ -2863,7 +2868,7 @@
         <w:pStyle w:val="Heading3"/>
       </w:pPr>
       <w:r>
-        <w:t xml:space="preserve">2.3 External System Interfaces</w:t>
+        <w:t xml:space="preserve">3.3 External System Interfaces</w:t>
       </w:r>
     </w:p>
     <w:tbl>
@@ -3691,7 +3696,7 @@
         <w:pStyle w:val="Heading3"/>
       </w:pPr>
       <w:r>
-        <w:t xml:space="preserve">2.4 Stakeholder Analysis</w:t>
+        <w:t xml:space="preserve">3.4 Stakeholder Analysis</w:t>
       </w:r>
     </w:p>
     <w:tbl>
@@ -4472,7 +4477,7 @@
         <w:pStyle w:val="Heading2"/>
       </w:pPr>
       <w:r>
-        <w:t xml:space="preserve">3. Logical Component Architecture</w:t>
+        <w:t xml:space="preserve">4. Data Architecture and Information Management</w:t>
       </w:r>
     </w:p>
     <w:p>
@@ -4480,61 +4485,7 @@
         <w:pStyle w:val="Heading3"/>
       </w:pPr>
       <w:r>
-        <w:t xml:space="preserve">3.1 Component Structure and Responsibilities</w:t>
-      </w:r>
-    </w:p>
-    <w:p>
-      <w:pPr>
-        <w:spacing w:after="80" w:before="40"/>
-      </w:pPr>
-      <w:r>
-        <w:t xml:space="preserve">The platform follows a layered architecture pattern with clear separation of concerns. Each layer exposes a narrow contract to the layer above it, and the data-access layer is the only tier that talks to SQL Server.</w:t>
-      </w:r>
-    </w:p>
-    <w:p>
-      <w:pPr>
-        <w:spacing w:after="100" w:before="80"/>
-        <w:jc w:val="center"/>
-      </w:pPr>
-      <w:r>
-        <w:drawing>
-          <wp:inline distT="0" distB="0" distL="0" distR="0">
-            <wp:extent cx="5905500" cy="6981825"/>
-            <wp:effectExtent t="0" r="0" b="0" l="0"/>
-            <wp:docPr id="1" name="diagram-architecture-3" descr="Mermaid diagram" title="Diagram"/>
-            <wp:cNvGraphicFramePr>
-              <a:graphicFrameLocks xmlns:a="http://schemas.openxmlformats.org/drawingml/2006/main" noChangeAspect="1"/>
-            </wp:cNvGraphicFramePr>
-            <a:graphic xmlns:a="http://schemas.openxmlformats.org/drawingml/2006/main">
-              <a:graphicData uri="http://schemas.openxmlformats.org/drawingml/2006/picture">
-                <pic:pic xmlns:pic="http://schemas.openxmlformats.org/drawingml/2006/picture">
-                  <pic:nvPicPr>
-                    <pic:cNvPr id="0" name="" descr=""/>
-                    <pic:cNvPicPr>
-                      <a:picLocks noChangeAspect="1" noChangeArrowheads="1"/>
-                    </pic:cNvPicPr>
-                  </pic:nvPicPr>
-                  <pic:blipFill>
-                    <a:blip r:embed="rId12" cstate="none"/>
-                    <a:srcRect/>
-                    <a:stretch>
-                      <a:fillRect/>
-                    </a:stretch>
-                  </pic:blipFill>
-                  <pic:spPr bwMode="auto">
-                    <a:xfrm>
-                      <a:off x="0" y="0"/>
-                      <a:ext cx="5905500" cy="6981825"/>
-                    </a:xfrm>
-                    <a:prstGeom prst="rect">
-                      <a:avLst/>
-                    </a:prstGeom>
-                  </pic:spPr>
-                </pic:pic>
-              </a:graphicData>
-            </a:graphic>
-          </wp:inline>
-        </w:drawing>
+        <w:t xml:space="preserve">4.1 Data Storage Strategy</w:t>
       </w:r>
     </w:p>
     <w:p>
@@ -4546,7 +4497,7 @@
           <w:b/>
           <w:bCs/>
         </w:rPr>
-        <w:t xml:space="preserve">Layer responsibilities:</w:t>
+        <w:t xml:space="preserve">SQL Server Primary Database:</w:t>
       </w:r>
     </w:p>
     <w:p>
@@ -4563,10 +4514,10 @@
           <w:b/>
           <w:bCs/>
         </w:rPr>
-        <w:t xml:space="preserve">Presentation:</w:t>
-      </w:r>
-      <w:r>
-        <w:t xml:space="preserve"> Customer Dashboard, Household Management, Account Summary, Transaction History, Notes, and Customer Overview screens. Technology: React 18, TypeScript, Material-UI, TanStack React Query (server state), Wouter (routing), React Hook Form + Zod (forms).</w:t>
+        <w:t xml:space="preserve">Primary Database:</w:t>
+      </w:r>
+      <w:r>
+        <w:t xml:space="preserve"> Microsoft SQL Server 2019+ with Always On Availability Groups (production)</w:t>
       </w:r>
     </w:p>
     <w:p>
@@ -4583,10 +4534,10 @@
           <w:b/>
           <w:bCs/>
         </w:rPr>
-        <w:t xml:space="preserve">API:</w:t>
-      </w:r>
-      <w:r>
-        <w:t xml:space="preserve"> Express route definitions, Zod request validation, standardized error handling; SAML authentication middleware (session validation, employee lookup/upsert from SAML assertions); authorization middleware (RBAC checks, ABAC conditional evaluation, privilege-level verification).</w:t>
+        <w:t xml:space="preserve">Session Store:</w:t>
+      </w:r>
+      <w:r>
+        <w:t xml:space="preserve"> SQL Server session table for stateful session management</w:t>
       </w:r>
     </w:p>
     <w:p>
@@ -4603,163 +4554,6 @@
           <w:b/>
           <w:bCs/>
         </w:rPr>
-        <w:t xml:space="preserve">Business Logic:</w:t>
-      </w:r>
-      <w:r>
-        <w:t xml:space="preserve"> Customer adapter (PII masking, DTO mapping), Account/Household/Transaction/Search services, Permission service (ABAC evaluation, audit logging), Note service (versioning, soft delete).</w:t>
-      </w:r>
-    </w:p>
-    <w:p>
-      <w:pPr>
-        <w:pStyle w:val="ListParagraph"/>
-        <w:numPr>
-          <w:ilvl w:val="0"/>
-          <w:numId w:val="2"/>
-        </w:numPr>
-        <w:spacing w:after="20" w:before="0"/>
-      </w:pPr>
-      <w:r>
-        <w:rPr>
-          <w:b/>
-          <w:bCs/>
-        </w:rPr>
-        <w:t xml:space="preserve">Data Access:</w:t>
-      </w:r>
-      <w:r>
-        <w:t xml:space="preserve"> SQL Server access via the </w:t>
-      </w:r>
-      <w:r>
-        <w:rPr>
-          <w:rFonts w:ascii="Consolas" w:cs="Consolas" w:eastAsia="Consolas" w:hAnsi="Consolas"/>
-          <w:sz w:val="20"/>
-          <w:szCs w:val="20"/>
-          <w:shd w:fill="EEF0F2" w:val="clear"/>
-        </w:rPr>
-        <w:t xml:space="preserve">mssql</w:t>
-      </w:r>
-      <w:r>
-        <w:t xml:space="preserve"> driver with parameterized queries and connection pooling; case-insensitive </w:t>
-      </w:r>
-      <w:r>
-        <w:rPr>
-          <w:rFonts w:ascii="Consolas" w:cs="Consolas" w:eastAsia="Consolas" w:hAnsi="Consolas"/>
-          <w:sz w:val="20"/>
-          <w:szCs w:val="20"/>
-          <w:shd w:fill="EEF0F2" w:val="clear"/>
-        </w:rPr>
-        <w:t xml:space="preserve">LIKE</w:t>
-      </w:r>
-      <w:r>
-        <w:t xml:space="preserve"> search over </w:t>
-      </w:r>
-      <w:r>
-        <w:rPr>
-          <w:rFonts w:ascii="Consolas" w:cs="Consolas" w:eastAsia="Consolas" w:hAnsi="Consolas"/>
-          <w:sz w:val="20"/>
-          <w:szCs w:val="20"/>
-          <w:shd w:fill="EEF0F2" w:val="clear"/>
-        </w:rPr>
-        <w:t xml:space="preserve">full_name</w:t>
-      </w:r>
-      <w:r>
-        <w:t xml:space="preserve">; SQL Server session store with automatic cleanup.</w:t>
-      </w:r>
-    </w:p>
-    <w:p>
-      <w:pPr>
-        <w:spacing w:after="60"/>
-      </w:pPr>
-    </w:p>
-    <w:p>
-      <w:pPr>
-        <w:pBdr>
-          <w:bottom w:val="single" w:color="333333" w:sz="6" w:space="1"/>
-        </w:pBdr>
-        <w:spacing w:after="80" w:before="80"/>
-      </w:pPr>
-    </w:p>
-    <w:p>
-      <w:pPr>
-        <w:pStyle w:val="Heading2"/>
-      </w:pPr>
-      <w:r>
-        <w:t xml:space="preserve">4. Data Architecture and Information Management</w:t>
-      </w:r>
-    </w:p>
-    <w:p>
-      <w:pPr>
-        <w:pStyle w:val="Heading3"/>
-      </w:pPr>
-      <w:r>
-        <w:t xml:space="preserve">4.1 Data Storage Strategy</w:t>
-      </w:r>
-    </w:p>
-    <w:p>
-      <w:pPr>
-        <w:spacing w:after="80" w:before="40"/>
-      </w:pPr>
-      <w:r>
-        <w:rPr>
-          <w:b/>
-          <w:bCs/>
-        </w:rPr>
-        <w:t xml:space="preserve">SQL Server Primary Database:</w:t>
-      </w:r>
-    </w:p>
-    <w:p>
-      <w:pPr>
-        <w:pStyle w:val="ListParagraph"/>
-        <w:numPr>
-          <w:ilvl w:val="0"/>
-          <w:numId w:val="2"/>
-        </w:numPr>
-        <w:spacing w:after="20" w:before="0"/>
-      </w:pPr>
-      <w:r>
-        <w:rPr>
-          <w:b/>
-          <w:bCs/>
-        </w:rPr>
-        <w:t xml:space="preserve">Primary Database:</w:t>
-      </w:r>
-      <w:r>
-        <w:t xml:space="preserve"> Microsoft SQL Server 2019+ with Always On Availability Groups (production)</w:t>
-      </w:r>
-    </w:p>
-    <w:p>
-      <w:pPr>
-        <w:pStyle w:val="ListParagraph"/>
-        <w:numPr>
-          <w:ilvl w:val="0"/>
-          <w:numId w:val="2"/>
-        </w:numPr>
-        <w:spacing w:after="20" w:before="0"/>
-      </w:pPr>
-      <w:r>
-        <w:rPr>
-          <w:b/>
-          <w:bCs/>
-        </w:rPr>
-        <w:t xml:space="preserve">Session Store:</w:t>
-      </w:r>
-      <w:r>
-        <w:t xml:space="preserve"> SQL Server session table for stateful session management</w:t>
-      </w:r>
-    </w:p>
-    <w:p>
-      <w:pPr>
-        <w:pStyle w:val="ListParagraph"/>
-        <w:numPr>
-          <w:ilvl w:val="0"/>
-          <w:numId w:val="2"/>
-        </w:numPr>
-        <w:spacing w:after="20" w:before="0"/>
-      </w:pPr>
-      <w:r>
-        <w:rPr>
-          <w:b/>
-          <w:bCs/>
-        </w:rPr>
         <w:t xml:space="preserve">Audit Store:</w:t>
       </w:r>
       <w:r>
@@ -4990,169 +4784,7 @@
         <w:t xml:space="preserve">full_name</w:t>
       </w:r>
       <w:r>
-        <w:t xml:space="preserve"> column (and tax id / core-banking identifiers), using </w:t>
-      </w:r>
-      <w:r>
-        <w:rPr>
-          <w:rFonts w:ascii="Consolas" w:cs="Consolas" w:eastAsia="Consolas" w:hAnsi="Consolas"/>
-          <w:sz w:val="20"/>
-          <w:szCs w:val="20"/>
-          <w:shd w:fill="EEF0F2" w:val="clear"/>
-        </w:rPr>
-        <w:t xml:space="preserve">COLLATE Latin1_General_CI_AS</w:t>
-      </w:r>
-      <w:r>
-        <w:t xml:space="preserve">. Non-clustered indexes on the search and join columns back the queries.</w:t>
-      </w:r>
-    </w:p>
-    <w:p>
-      <w:pPr>
-        <w:shd w:fill="F4F5F6" w:val="clear"/>
-        <w:spacing w:after="0" w:before="40" w:line="240"/>
-        <w:ind w:left="120" w:right="120"/>
-      </w:pPr>
-      <w:r>
-        <w:rPr>
-          <w:rFonts w:ascii="Consolas" w:cs="Consolas" w:eastAsia="Consolas" w:hAnsi="Consolas"/>
-          <w:sz w:val="18"/>
-          <w:szCs w:val="18"/>
-        </w:rPr>
-        <w:t xml:space="preserve">-- Customer search (case-insensitive LIKE over the unified full_name column)</w:t>
-      </w:r>
-    </w:p>
-    <w:p>
-      <w:pPr>
-        <w:shd w:fill="F4F5F6" w:val="clear"/>
-        <w:spacing w:after="0" w:before="0" w:line="240"/>
-        <w:ind w:left="120" w:right="120"/>
-      </w:pPr>
-      <w:r>
-        <w:rPr>
-          <w:rFonts w:ascii="Consolas" w:cs="Consolas" w:eastAsia="Consolas" w:hAnsi="Consolas"/>
-          <w:sz w:val="18"/>
-          <w:szCs w:val="18"/>
-        </w:rPr>
-        <w:t xml:space="preserve">SELECT customer_id, full_name, customer_type</w:t>
-      </w:r>
-    </w:p>
-    <w:p>
-      <w:pPr>
-        <w:shd w:fill="F4F5F6" w:val="clear"/>
-        <w:spacing w:after="0" w:before="0" w:line="240"/>
-        <w:ind w:left="120" w:right="120"/>
-      </w:pPr>
-      <w:r>
-        <w:rPr>
-          <w:rFonts w:ascii="Consolas" w:cs="Consolas" w:eastAsia="Consolas" w:hAnsi="Consolas"/>
-          <w:sz w:val="18"/>
-          <w:szCs w:val="18"/>
-        </w:rPr>
-        <w:t xml:space="preserve">FROM customer</w:t>
-      </w:r>
-    </w:p>
-    <w:p>
-      <w:pPr>
-        <w:shd w:fill="F4F5F6" w:val="clear"/>
-        <w:spacing w:after="0" w:before="0" w:line="240"/>
-        <w:ind w:left="120" w:right="120"/>
-      </w:pPr>
-      <w:r>
-        <w:rPr>
-          <w:rFonts w:ascii="Consolas" w:cs="Consolas" w:eastAsia="Consolas" w:hAnsi="Consolas"/>
-          <w:sz w:val="18"/>
-          <w:szCs w:val="18"/>
-        </w:rPr>
-        <w:t xml:space="preserve">WHERE full_name COLLATE Latin1_General_CI_AS LIKE '%' + @term + '%'</w:t>
-      </w:r>
-    </w:p>
-    <w:p>
-      <w:pPr>
-        <w:shd w:fill="F4F5F6" w:val="clear"/>
-        <w:spacing w:after="0" w:before="0" w:line="240"/>
-        <w:ind w:left="120" w:right="120"/>
-      </w:pPr>
-      <w:r>
-        <w:rPr>
-          <w:rFonts w:ascii="Consolas" w:cs="Consolas" w:eastAsia="Consolas" w:hAnsi="Consolas"/>
-          <w:sz w:val="18"/>
-          <w:szCs w:val="18"/>
-        </w:rPr>
-        <w:t xml:space="preserve">   OR tax_identifier LIKE @term + '%'</w:t>
-      </w:r>
-    </w:p>
-    <w:p>
-      <w:pPr>
-        <w:shd w:fill="F4F5F6" w:val="clear"/>
-        <w:spacing w:after="0" w:before="0" w:line="240"/>
-        <w:ind w:left="120" w:right="120"/>
-      </w:pPr>
-      <w:r>
-        <w:rPr>
-          <w:rFonts w:ascii="Consolas" w:cs="Consolas" w:eastAsia="Consolas" w:hAnsi="Consolas"/>
-          <w:sz w:val="18"/>
-          <w:szCs w:val="18"/>
-        </w:rPr>
-        <w:t xml:space="preserve">ORDER BY customer_id;</w:t>
-      </w:r>
-    </w:p>
-    <w:p>
-      <w:pPr>
-        <w:shd w:fill="F4F5F6" w:val="clear"/>
-        <w:spacing w:after="0" w:before="0" w:line="240"/>
-        <w:ind w:left="120" w:right="120"/>
-      </w:pPr>
-      <w:r>
-        <w:rPr>
-          <w:rFonts w:ascii="Consolas" w:cs="Consolas" w:eastAsia="Consolas" w:hAnsi="Consolas"/>
-          <w:sz w:val="18"/>
-          <w:szCs w:val="18"/>
-        </w:rPr>
-        <w:t xml:space="preserve"> </w:t>
-      </w:r>
-    </w:p>
-    <w:p>
-      <w:pPr>
-        <w:shd w:fill="F4F5F6" w:val="clear"/>
-        <w:spacing w:after="0" w:before="0" w:line="240"/>
-        <w:ind w:left="120" w:right="120"/>
-      </w:pPr>
-      <w:r>
-        <w:rPr>
-          <w:rFonts w:ascii="Consolas" w:cs="Consolas" w:eastAsia="Consolas" w:hAnsi="Consolas"/>
-          <w:sz w:val="18"/>
-          <w:szCs w:val="18"/>
-        </w:rPr>
-        <w:t xml:space="preserve">-- Supporting indexes (see scripts/create_performance_indexes.sql)</w:t>
-      </w:r>
-    </w:p>
-    <w:p>
-      <w:pPr>
-        <w:shd w:fill="F4F5F6" w:val="clear"/>
-        <w:spacing w:after="0" w:before="0" w:line="240"/>
-        <w:ind w:left="120" w:right="120"/>
-      </w:pPr>
-      <w:r>
-        <w:rPr>
-          <w:rFonts w:ascii="Consolas" w:cs="Consolas" w:eastAsia="Consolas" w:hAnsi="Consolas"/>
-          <w:sz w:val="18"/>
-          <w:szCs w:val="18"/>
-        </w:rPr>
-        <w:t xml:space="preserve">CREATE INDEX idx_customer_full_name ON customer(full_name);</w:t>
-      </w:r>
-    </w:p>
-    <w:p>
-      <w:pPr>
-        <w:shd w:fill="F4F5F6" w:val="clear"/>
-        <w:spacing w:after="40" w:before="0" w:line="240"/>
-        <w:ind w:left="120" w:right="120"/>
-      </w:pPr>
-      <w:r>
-        <w:rPr>
-          <w:rFonts w:ascii="Consolas" w:cs="Consolas" w:eastAsia="Consolas" w:hAnsi="Consolas"/>
-          <w:sz w:val="18"/>
-          <w:szCs w:val="18"/>
-        </w:rPr>
-        <w:t xml:space="preserve">CREATE INDEX idx_customer_tax_id ON customer(tax_identifier);</w:t>
+        <w:t xml:space="preserve"> column (and tax id / core-banking identifiers), using a case-insensitive collation. Non-clustered indexes on the search and join columns back the queries, and the search service returns exact, partial, and fuzzy indicators for the caller.</w:t>
       </w:r>
     </w:p>
     <w:p>
@@ -5241,15 +4873,15 @@
     </w:p>
     <w:p>
       <w:pPr>
-        <w:spacing w:after="100" w:before="80"/>
+        <w:spacing w:after="80" w:before="40"/>
         <w:jc w:val="center"/>
       </w:pPr>
       <w:r>
         <w:drawing>
           <wp:inline distT="0" distB="0" distL="0" distR="0">
-            <wp:extent cx="5905500" cy="3419475"/>
+            <wp:extent cx="6286500" cy="3638550"/>
             <wp:effectExtent t="0" r="0" b="0" l="0"/>
-            <wp:docPr id="1" name="diagram-architecture-4" descr="Mermaid diagram" title="Diagram"/>
+            <wp:docPr id="1" name="img-images-arch-core-erd-png" descr="ClientIQ core data model (entity-relationship diagram). Customer relates to household (via household membership), to account (via account ownership), to debit card, and to a relationship-manager employee; account relates to branch and to debit card; debit card relates to a debit-card limit profile; branch relates to region and address. Key attributes shown as SQL Server types (bigint IDENTITY primary keys, varchar, nvarchar(max), datetime2)." title="ClientIQ core data model (entity-relationship diagram). Customer relates to household (via household membership), to account (via account ownership), to debit card, and to a relationship-manager employee; account relates to branch and to debit card; debit card relates to a debit-card limit profile; branch relates to region and address. Key attributes shown as SQL Server types (bigint IDENTITY primary keys, varchar, nvarchar(max), datetime2)."/>
             <wp:cNvGraphicFramePr>
               <a:graphicFrameLocks xmlns:a="http://schemas.openxmlformats.org/drawingml/2006/main" noChangeAspect="1"/>
             </wp:cNvGraphicFramePr>
@@ -5272,7 +4904,7 @@
                   <pic:spPr bwMode="auto">
                     <a:xfrm>
                       <a:off x="0" y="0"/>
-                      <a:ext cx="5905500" cy="3419475"/>
+                      <a:ext cx="6286500" cy="3638550"/>
                     </a:xfrm>
                     <a:prstGeom prst="rect">
                       <a:avLst/>
@@ -5290,736 +4922,7 @@
         <w:pStyle w:val="Heading3"/>
       </w:pPr>
       <w:r>
-        <w:t xml:space="preserve">4.4 Database Schema Highlights (SQL Server)</w:t>
-      </w:r>
-    </w:p>
-    <w:p>
-      <w:pPr>
-        <w:spacing w:after="80" w:before="40"/>
-      </w:pPr>
-      <w:r>
-        <w:t xml:space="preserve">Representative DDL for the </w:t>
-      </w:r>
-      <w:r>
-        <w:rPr>
-          <w:rFonts w:ascii="Consolas" w:cs="Consolas" w:eastAsia="Consolas" w:hAnsi="Consolas"/>
-          <w:sz w:val="20"/>
-          <w:szCs w:val="20"/>
-          <w:shd w:fill="EEF0F2" w:val="clear"/>
-        </w:rPr>
-        <w:t xml:space="preserve">customer</w:t>
-      </w:r>
-      <w:r>
-        <w:t xml:space="preserve"> table. Conditional name requirements (individual vs business/trust) are enforced in application code (Zod discriminated union), not by a database CHECK constraint.</w:t>
-      </w:r>
-    </w:p>
-    <w:p>
-      <w:pPr>
-        <w:shd w:fill="F4F5F6" w:val="clear"/>
-        <w:spacing w:after="0" w:before="40" w:line="240"/>
-        <w:ind w:left="120" w:right="120"/>
-      </w:pPr>
-      <w:r>
-        <w:rPr>
-          <w:rFonts w:ascii="Consolas" w:cs="Consolas" w:eastAsia="Consolas" w:hAnsi="Consolas"/>
-          <w:sz w:val="18"/>
-          <w:szCs w:val="18"/>
-        </w:rPr>
-        <w:t xml:space="preserve">CREATE TABLE customer (</w:t>
-      </w:r>
-    </w:p>
-    <w:p>
-      <w:pPr>
-        <w:shd w:fill="F4F5F6" w:val="clear"/>
-        <w:spacing w:after="0" w:before="0" w:line="240"/>
-        <w:ind w:left="120" w:right="120"/>
-      </w:pPr>
-      <w:r>
-        <w:rPr>
-          <w:rFonts w:ascii="Consolas" w:cs="Consolas" w:eastAsia="Consolas" w:hAnsi="Consolas"/>
-          <w:sz w:val="18"/>
-          <w:szCs w:val="18"/>
-        </w:rPr>
-        <w:t xml:space="preserve">  customer_id            BIGINT IDENTITY(1,1) PRIMARY KEY,</w:t>
-      </w:r>
-    </w:p>
-    <w:p>
-      <w:pPr>
-        <w:shd w:fill="F4F5F6" w:val="clear"/>
-        <w:spacing w:after="0" w:before="0" w:line="240"/>
-        <w:ind w:left="120" w:right="120"/>
-      </w:pPr>
-      <w:r>
-        <w:rPr>
-          <w:rFonts w:ascii="Consolas" w:cs="Consolas" w:eastAsia="Consolas" w:hAnsi="Consolas"/>
-          <w:sz w:val="18"/>
-          <w:szCs w:val="18"/>
-        </w:rPr>
-        <w:t xml:space="preserve"> </w:t>
-      </w:r>
-    </w:p>
-    <w:p>
-      <w:pPr>
-        <w:shd w:fill="F4F5F6" w:val="clear"/>
-        <w:spacing w:after="0" w:before="0" w:line="240"/>
-        <w:ind w:left="120" w:right="120"/>
-      </w:pPr>
-      <w:r>
-        <w:rPr>
-          <w:rFonts w:ascii="Consolas" w:cs="Consolas" w:eastAsia="Consolas" w:hAnsi="Consolas"/>
-          <w:sz w:val="18"/>
-          <w:szCs w:val="18"/>
-        </w:rPr>
-        <w:t xml:space="preserve">  -- Individual customer fields</w:t>
-      </w:r>
-    </w:p>
-    <w:p>
-      <w:pPr>
-        <w:shd w:fill="F4F5F6" w:val="clear"/>
-        <w:spacing w:after="0" w:before="0" w:line="240"/>
-        <w:ind w:left="120" w:right="120"/>
-      </w:pPr>
-      <w:r>
-        <w:rPr>
-          <w:rFonts w:ascii="Consolas" w:cs="Consolas" w:eastAsia="Consolas" w:hAnsi="Consolas"/>
-          <w:sz w:val="18"/>
-          <w:szCs w:val="18"/>
-        </w:rPr>
-        <w:t xml:space="preserve">  first_name             NVARCHAR(100),</w:t>
-      </w:r>
-    </w:p>
-    <w:p>
-      <w:pPr>
-        <w:shd w:fill="F4F5F6" w:val="clear"/>
-        <w:spacing w:after="0" w:before="0" w:line="240"/>
-        <w:ind w:left="120" w:right="120"/>
-      </w:pPr>
-      <w:r>
-        <w:rPr>
-          <w:rFonts w:ascii="Consolas" w:cs="Consolas" w:eastAsia="Consolas" w:hAnsi="Consolas"/>
-          <w:sz w:val="18"/>
-          <w:szCs w:val="18"/>
-        </w:rPr>
-        <w:t xml:space="preserve">  last_name              NVARCHAR(100),</w:t>
-      </w:r>
-    </w:p>
-    <w:p>
-      <w:pPr>
-        <w:shd w:fill="F4F5F6" w:val="clear"/>
-        <w:spacing w:after="0" w:before="0" w:line="240"/>
-        <w:ind w:left="120" w:right="120"/>
-      </w:pPr>
-      <w:r>
-        <w:rPr>
-          <w:rFonts w:ascii="Consolas" w:cs="Consolas" w:eastAsia="Consolas" w:hAnsi="Consolas"/>
-          <w:sz w:val="18"/>
-          <w:szCs w:val="18"/>
-        </w:rPr>
-        <w:t xml:space="preserve">  middle_name            NVARCHAR(100),</w:t>
-      </w:r>
-    </w:p>
-    <w:p>
-      <w:pPr>
-        <w:shd w:fill="F4F5F6" w:val="clear"/>
-        <w:spacing w:after="0" w:before="0" w:line="240"/>
-        <w:ind w:left="120" w:right="120"/>
-      </w:pPr>
-      <w:r>
-        <w:rPr>
-          <w:rFonts w:ascii="Consolas" w:cs="Consolas" w:eastAsia="Consolas" w:hAnsi="Consolas"/>
-          <w:sz w:val="18"/>
-          <w:szCs w:val="18"/>
-        </w:rPr>
-        <w:t xml:space="preserve">  date_of_birth          DATE,</w:t>
-      </w:r>
-    </w:p>
-    <w:p>
-      <w:pPr>
-        <w:shd w:fill="F4F5F6" w:val="clear"/>
-        <w:spacing w:after="0" w:before="0" w:line="240"/>
-        <w:ind w:left="120" w:right="120"/>
-      </w:pPr>
-      <w:r>
-        <w:rPr>
-          <w:rFonts w:ascii="Consolas" w:cs="Consolas" w:eastAsia="Consolas" w:hAnsi="Consolas"/>
-          <w:sz w:val="18"/>
-          <w:szCs w:val="18"/>
-        </w:rPr>
-        <w:t xml:space="preserve"> </w:t>
-      </w:r>
-    </w:p>
-    <w:p>
-      <w:pPr>
-        <w:shd w:fill="F4F5F6" w:val="clear"/>
-        <w:spacing w:after="0" w:before="0" w:line="240"/>
-        <w:ind w:left="120" w:right="120"/>
-      </w:pPr>
-      <w:r>
-        <w:rPr>
-          <w:rFonts w:ascii="Consolas" w:cs="Consolas" w:eastAsia="Consolas" w:hAnsi="Consolas"/>
-          <w:sz w:val="18"/>
-          <w:szCs w:val="18"/>
-        </w:rPr>
-        <w:t xml:space="preserve">  -- Business customer fields</w:t>
-      </w:r>
-    </w:p>
-    <w:p>
-      <w:pPr>
-        <w:shd w:fill="F4F5F6" w:val="clear"/>
-        <w:spacing w:after="0" w:before="0" w:line="240"/>
-        <w:ind w:left="120" w:right="120"/>
-      </w:pPr>
-      <w:r>
-        <w:rPr>
-          <w:rFonts w:ascii="Consolas" w:cs="Consolas" w:eastAsia="Consolas" w:hAnsi="Consolas"/>
-          <w:sz w:val="18"/>
-          <w:szCs w:val="18"/>
-        </w:rPr>
-        <w:t xml:space="preserve">  business_name          NVARCHAR(200),</w:t>
-      </w:r>
-    </w:p>
-    <w:p>
-      <w:pPr>
-        <w:shd w:fill="F4F5F6" w:val="clear"/>
-        <w:spacing w:after="0" w:before="0" w:line="240"/>
-        <w:ind w:left="120" w:right="120"/>
-      </w:pPr>
-      <w:r>
-        <w:rPr>
-          <w:rFonts w:ascii="Consolas" w:cs="Consolas" w:eastAsia="Consolas" w:hAnsi="Consolas"/>
-          <w:sz w:val="18"/>
-          <w:szCs w:val="18"/>
-        </w:rPr>
-        <w:t xml:space="preserve">  dba_name               NVARCHAR(200),</w:t>
-      </w:r>
-    </w:p>
-    <w:p>
-      <w:pPr>
-        <w:shd w:fill="F4F5F6" w:val="clear"/>
-        <w:spacing w:after="0" w:before="0" w:line="240"/>
-        <w:ind w:left="120" w:right="120"/>
-      </w:pPr>
-      <w:r>
-        <w:rPr>
-          <w:rFonts w:ascii="Consolas" w:cs="Consolas" w:eastAsia="Consolas" w:hAnsi="Consolas"/>
-          <w:sz w:val="18"/>
-          <w:szCs w:val="18"/>
-        </w:rPr>
-        <w:t xml:space="preserve"> </w:t>
-      </w:r>
-    </w:p>
-    <w:p>
-      <w:pPr>
-        <w:shd w:fill="F4F5F6" w:val="clear"/>
-        <w:spacing w:after="0" w:before="0" w:line="240"/>
-        <w:ind w:left="120" w:right="120"/>
-      </w:pPr>
-      <w:r>
-        <w:rPr>
-          <w:rFonts w:ascii="Consolas" w:cs="Consolas" w:eastAsia="Consolas" w:hAnsi="Consolas"/>
-          <w:sz w:val="18"/>
-          <w:szCs w:val="18"/>
-        </w:rPr>
-        <w:t xml:space="preserve">  -- Unified search field (populated by the load)</w:t>
-      </w:r>
-    </w:p>
-    <w:p>
-      <w:pPr>
-        <w:shd w:fill="F4F5F6" w:val="clear"/>
-        <w:spacing w:after="0" w:before="0" w:line="240"/>
-        <w:ind w:left="120" w:right="120"/>
-      </w:pPr>
-      <w:r>
-        <w:rPr>
-          <w:rFonts w:ascii="Consolas" w:cs="Consolas" w:eastAsia="Consolas" w:hAnsi="Consolas"/>
-          <w:sz w:val="18"/>
-          <w:szCs w:val="18"/>
-        </w:rPr>
-        <w:t xml:space="preserve">  full_name              NVARCHAR(200),</w:t>
-      </w:r>
-    </w:p>
-    <w:p>
-      <w:pPr>
-        <w:shd w:fill="F4F5F6" w:val="clear"/>
-        <w:spacing w:after="0" w:before="0" w:line="240"/>
-        <w:ind w:left="120" w:right="120"/>
-      </w:pPr>
-      <w:r>
-        <w:rPr>
-          <w:rFonts w:ascii="Consolas" w:cs="Consolas" w:eastAsia="Consolas" w:hAnsi="Consolas"/>
-          <w:sz w:val="18"/>
-          <w:szCs w:val="18"/>
-        </w:rPr>
-        <w:t xml:space="preserve"> </w:t>
-      </w:r>
-    </w:p>
-    <w:p>
-      <w:pPr>
-        <w:shd w:fill="F4F5F6" w:val="clear"/>
-        <w:spacing w:after="0" w:before="0" w:line="240"/>
-        <w:ind w:left="120" w:right="120"/>
-      </w:pPr>
-      <w:r>
-        <w:rPr>
-          <w:rFonts w:ascii="Consolas" w:cs="Consolas" w:eastAsia="Consolas" w:hAnsi="Consolas"/>
-          <w:sz w:val="18"/>
-          <w:szCs w:val="18"/>
-        </w:rPr>
-        <w:t xml:space="preserve">  -- Identification (masked in UI)</w:t>
-      </w:r>
-    </w:p>
-    <w:p>
-      <w:pPr>
-        <w:shd w:fill="F4F5F6" w:val="clear"/>
-        <w:spacing w:after="0" w:before="0" w:line="240"/>
-        <w:ind w:left="120" w:right="120"/>
-      </w:pPr>
-      <w:r>
-        <w:rPr>
-          <w:rFonts w:ascii="Consolas" w:cs="Consolas" w:eastAsia="Consolas" w:hAnsi="Consolas"/>
-          <w:sz w:val="18"/>
-          <w:szCs w:val="18"/>
-        </w:rPr>
-        <w:t xml:space="preserve">  tax_identifier         NVARCHAR(20) UNIQUE,</w:t>
-      </w:r>
-    </w:p>
-    <w:p>
-      <w:pPr>
-        <w:shd w:fill="F4F5F6" w:val="clear"/>
-        <w:spacing w:after="0" w:before="0" w:line="240"/>
-        <w:ind w:left="120" w:right="120"/>
-      </w:pPr>
-      <w:r>
-        <w:rPr>
-          <w:rFonts w:ascii="Consolas" w:cs="Consolas" w:eastAsia="Consolas" w:hAnsi="Consolas"/>
-          <w:sz w:val="18"/>
-          <w:szCs w:val="18"/>
-        </w:rPr>
-        <w:t xml:space="preserve">  government_id          NVARCHAR(50),</w:t>
-      </w:r>
-    </w:p>
-    <w:p>
-      <w:pPr>
-        <w:shd w:fill="F4F5F6" w:val="clear"/>
-        <w:spacing w:after="0" w:before="0" w:line="240"/>
-        <w:ind w:left="120" w:right="120"/>
-      </w:pPr>
-      <w:r>
-        <w:rPr>
-          <w:rFonts w:ascii="Consolas" w:cs="Consolas" w:eastAsia="Consolas" w:hAnsi="Consolas"/>
-          <w:sz w:val="18"/>
-          <w:szCs w:val="18"/>
-        </w:rPr>
-        <w:t xml:space="preserve"> </w:t>
-      </w:r>
-    </w:p>
-    <w:p>
-      <w:pPr>
-        <w:shd w:fill="F4F5F6" w:val="clear"/>
-        <w:spacing w:after="0" w:before="0" w:line="240"/>
-        <w:ind w:left="120" w:right="120"/>
-      </w:pPr>
-      <w:r>
-        <w:rPr>
-          <w:rFonts w:ascii="Consolas" w:cs="Consolas" w:eastAsia="Consolas" w:hAnsi="Consolas"/>
-          <w:sz w:val="18"/>
-          <w:szCs w:val="18"/>
-        </w:rPr>
-        <w:t xml:space="preserve">  -- Classification</w:t>
-      </w:r>
-    </w:p>
-    <w:p>
-      <w:pPr>
-        <w:shd w:fill="F4F5F6" w:val="clear"/>
-        <w:spacing w:after="0" w:before="0" w:line="240"/>
-        <w:ind w:left="120" w:right="120"/>
-      </w:pPr>
-      <w:r>
-        <w:rPr>
-          <w:rFonts w:ascii="Consolas" w:cs="Consolas" w:eastAsia="Consolas" w:hAnsi="Consolas"/>
-          <w:sz w:val="18"/>
-          <w:szCs w:val="18"/>
-        </w:rPr>
-        <w:t xml:space="preserve">  customer_type          NVARCHAR(20) NOT NULL DEFAULT 'regular',</w:t>
-      </w:r>
-    </w:p>
-    <w:p>
-      <w:pPr>
-        <w:shd w:fill="F4F5F6" w:val="clear"/>
-        <w:spacing w:after="0" w:before="0" w:line="240"/>
-        <w:ind w:left="120" w:right="120"/>
-      </w:pPr>
-      <w:r>
-        <w:rPr>
-          <w:rFonts w:ascii="Consolas" w:cs="Consolas" w:eastAsia="Consolas" w:hAnsi="Consolas"/>
-          <w:sz w:val="18"/>
-          <w:szCs w:val="18"/>
-        </w:rPr>
-        <w:t xml:space="preserve">  customer_status        NVARCHAR(20) DEFAULT 'active',</w:t>
-      </w:r>
-    </w:p>
-    <w:p>
-      <w:pPr>
-        <w:shd w:fill="F4F5F6" w:val="clear"/>
-        <w:spacing w:after="0" w:before="0" w:line="240"/>
-        <w:ind w:left="120" w:right="120"/>
-      </w:pPr>
-      <w:r>
-        <w:rPr>
-          <w:rFonts w:ascii="Consolas" w:cs="Consolas" w:eastAsia="Consolas" w:hAnsi="Consolas"/>
-          <w:sz w:val="18"/>
-          <w:szCs w:val="18"/>
-        </w:rPr>
-        <w:t xml:space="preserve"> </w:t>
-      </w:r>
-    </w:p>
-    <w:p>
-      <w:pPr>
-        <w:shd w:fill="F4F5F6" w:val="clear"/>
-        <w:spacing w:after="0" w:before="0" w:line="240"/>
-        <w:ind w:left="120" w:right="120"/>
-      </w:pPr>
-      <w:r>
-        <w:rPr>
-          <w:rFonts w:ascii="Consolas" w:cs="Consolas" w:eastAsia="Consolas" w:hAnsi="Consolas"/>
-          <w:sz w:val="18"/>
-          <w:szCs w:val="18"/>
-        </w:rPr>
-        <w:t xml:space="preserve">  -- Compliance</w:t>
-      </w:r>
-    </w:p>
-    <w:p>
-      <w:pPr>
-        <w:shd w:fill="F4F5F6" w:val="clear"/>
-        <w:spacing w:after="0" w:before="0" w:line="240"/>
-        <w:ind w:left="120" w:right="120"/>
-      </w:pPr>
-      <w:r>
-        <w:rPr>
-          <w:rFonts w:ascii="Consolas" w:cs="Consolas" w:eastAsia="Consolas" w:hAnsi="Consolas"/>
-          <w:sz w:val="18"/>
-          <w:szCs w:val="18"/>
-        </w:rPr>
-        <w:t xml:space="preserve">  kyc_status             NVARCHAR(20),</w:t>
-      </w:r>
-    </w:p>
-    <w:p>
-      <w:pPr>
-        <w:shd w:fill="F4F5F6" w:val="clear"/>
-        <w:spacing w:after="0" w:before="0" w:line="240"/>
-        <w:ind w:left="120" w:right="120"/>
-      </w:pPr>
-      <w:r>
-        <w:rPr>
-          <w:rFonts w:ascii="Consolas" w:cs="Consolas" w:eastAsia="Consolas" w:hAnsi="Consolas"/>
-          <w:sz w:val="18"/>
-          <w:szCs w:val="18"/>
-        </w:rPr>
-        <w:t xml:space="preserve">  risk_rating            NVARCHAR(20),</w:t>
-      </w:r>
-    </w:p>
-    <w:p>
-      <w:pPr>
-        <w:shd w:fill="F4F5F6" w:val="clear"/>
-        <w:spacing w:after="0" w:before="0" w:line="240"/>
-        <w:ind w:left="120" w:right="120"/>
-      </w:pPr>
-      <w:r>
-        <w:rPr>
-          <w:rFonts w:ascii="Consolas" w:cs="Consolas" w:eastAsia="Consolas" w:hAnsi="Consolas"/>
-          <w:sz w:val="18"/>
-          <w:szCs w:val="18"/>
-        </w:rPr>
-        <w:t xml:space="preserve"> </w:t>
-      </w:r>
-    </w:p>
-    <w:p>
-      <w:pPr>
-        <w:shd w:fill="F4F5F6" w:val="clear"/>
-        <w:spacing w:after="0" w:before="0" w:line="240"/>
-        <w:ind w:left="120" w:right="120"/>
-      </w:pPr>
-      <w:r>
-        <w:rPr>
-          <w:rFonts w:ascii="Consolas" w:cs="Consolas" w:eastAsia="Consolas" w:hAnsi="Consolas"/>
-          <w:sz w:val="18"/>
-          <w:szCs w:val="18"/>
-        </w:rPr>
-        <w:t xml:space="preserve">  -- Flags</w:t>
-      </w:r>
-    </w:p>
-    <w:p>
-      <w:pPr>
-        <w:shd w:fill="F4F5F6" w:val="clear"/>
-        <w:spacing w:after="0" w:before="0" w:line="240"/>
-        <w:ind w:left="120" w:right="120"/>
-      </w:pPr>
-      <w:r>
-        <w:rPr>
-          <w:rFonts w:ascii="Consolas" w:cs="Consolas" w:eastAsia="Consolas" w:hAnsi="Consolas"/>
-          <w:sz w:val="18"/>
-          <w:szCs w:val="18"/>
-        </w:rPr>
-        <w:t xml:space="preserve">  is_employee            BIT DEFAULT 0,</w:t>
-      </w:r>
-    </w:p>
-    <w:p>
-      <w:pPr>
-        <w:shd w:fill="F4F5F6" w:val="clear"/>
-        <w:spacing w:after="0" w:before="0" w:line="240"/>
-        <w:ind w:left="120" w:right="120"/>
-      </w:pPr>
-      <w:r>
-        <w:rPr>
-          <w:rFonts w:ascii="Consolas" w:cs="Consolas" w:eastAsia="Consolas" w:hAnsi="Consolas"/>
-          <w:sz w:val="18"/>
-          <w:szCs w:val="18"/>
-        </w:rPr>
-        <w:t xml:space="preserve">  vip_customer           BIT DEFAULT 0,</w:t>
-      </w:r>
-    </w:p>
-    <w:p>
-      <w:pPr>
-        <w:shd w:fill="F4F5F6" w:val="clear"/>
-        <w:spacing w:after="0" w:before="0" w:line="240"/>
-        <w:ind w:left="120" w:right="120"/>
-      </w:pPr>
-      <w:r>
-        <w:rPr>
-          <w:rFonts w:ascii="Consolas" w:cs="Consolas" w:eastAsia="Consolas" w:hAnsi="Consolas"/>
-          <w:sz w:val="18"/>
-          <w:szCs w:val="18"/>
-        </w:rPr>
-        <w:t xml:space="preserve">  is_deceased            BIT DEFAULT 0,</w:t>
-      </w:r>
-    </w:p>
-    <w:p>
-      <w:pPr>
-        <w:shd w:fill="F4F5F6" w:val="clear"/>
-        <w:spacing w:after="0" w:before="0" w:line="240"/>
-        <w:ind w:left="120" w:right="120"/>
-      </w:pPr>
-      <w:r>
-        <w:rPr>
-          <w:rFonts w:ascii="Consolas" w:cs="Consolas" w:eastAsia="Consolas" w:hAnsi="Consolas"/>
-          <w:sz w:val="18"/>
-          <w:szCs w:val="18"/>
-        </w:rPr>
-        <w:t xml:space="preserve"> </w:t>
-      </w:r>
-    </w:p>
-    <w:p>
-      <w:pPr>
-        <w:shd w:fill="F4F5F6" w:val="clear"/>
-        <w:spacing w:after="0" w:before="0" w:line="240"/>
-        <w:ind w:left="120" w:right="120"/>
-      </w:pPr>
-      <w:r>
-        <w:rPr>
-          <w:rFonts w:ascii="Consolas" w:cs="Consolas" w:eastAsia="Consolas" w:hAnsi="Consolas"/>
-          <w:sz w:val="18"/>
-          <w:szCs w:val="18"/>
-        </w:rPr>
-        <w:t xml:space="preserve">  -- Core banking integration</w:t>
-      </w:r>
-    </w:p>
-    <w:p>
-      <w:pPr>
-        <w:shd w:fill="F4F5F6" w:val="clear"/>
-        <w:spacing w:after="0" w:before="0" w:line="240"/>
-        <w:ind w:left="120" w:right="120"/>
-      </w:pPr>
-      <w:r>
-        <w:rPr>
-          <w:rFonts w:ascii="Consolas" w:cs="Consolas" w:eastAsia="Consolas" w:hAnsi="Consolas"/>
-          <w:sz w:val="18"/>
-          <w:szCs w:val="18"/>
-        </w:rPr>
-        <w:t xml:space="preserve">  jack_henry_cif_number  NVARCHAR(20),</w:t>
-      </w:r>
-    </w:p>
-    <w:p>
-      <w:pPr>
-        <w:shd w:fill="F4F5F6" w:val="clear"/>
-        <w:spacing w:after="0" w:before="0" w:line="240"/>
-        <w:ind w:left="120" w:right="120"/>
-      </w:pPr>
-      <w:r>
-        <w:rPr>
-          <w:rFonts w:ascii="Consolas" w:cs="Consolas" w:eastAsia="Consolas" w:hAnsi="Consolas"/>
-          <w:sz w:val="18"/>
-          <w:szCs w:val="18"/>
-        </w:rPr>
-        <w:t xml:space="preserve">  silverlake_customer_id NVARCHAR(20)</w:t>
-      </w:r>
-    </w:p>
-    <w:p>
-      <w:pPr>
-        <w:shd w:fill="F4F5F6" w:val="clear"/>
-        <w:spacing w:after="0" w:before="0" w:line="240"/>
-        <w:ind w:left="120" w:right="120"/>
-      </w:pPr>
-      <w:r>
-        <w:rPr>
-          <w:rFonts w:ascii="Consolas" w:cs="Consolas" w:eastAsia="Consolas" w:hAnsi="Consolas"/>
-          <w:sz w:val="18"/>
-          <w:szCs w:val="18"/>
-        </w:rPr>
-        <w:t xml:space="preserve">);</w:t>
-      </w:r>
-    </w:p>
-    <w:p>
-      <w:pPr>
-        <w:shd w:fill="F4F5F6" w:val="clear"/>
-        <w:spacing w:after="0" w:before="0" w:line="240"/>
-        <w:ind w:left="120" w:right="120"/>
-      </w:pPr>
-      <w:r>
-        <w:rPr>
-          <w:rFonts w:ascii="Consolas" w:cs="Consolas" w:eastAsia="Consolas" w:hAnsi="Consolas"/>
-          <w:sz w:val="18"/>
-          <w:szCs w:val="18"/>
-        </w:rPr>
-        <w:t xml:space="preserve"> </w:t>
-      </w:r>
-    </w:p>
-    <w:p>
-      <w:pPr>
-        <w:shd w:fill="F4F5F6" w:val="clear"/>
-        <w:spacing w:after="0" w:before="0" w:line="240"/>
-        <w:ind w:left="120" w:right="120"/>
-      </w:pPr>
-      <w:r>
-        <w:rPr>
-          <w:rFonts w:ascii="Consolas" w:cs="Consolas" w:eastAsia="Consolas" w:hAnsi="Consolas"/>
-          <w:sz w:val="18"/>
-          <w:szCs w:val="18"/>
-        </w:rPr>
-        <w:t xml:space="preserve">-- Supporting indexes</w:t>
-      </w:r>
-    </w:p>
-    <w:p>
-      <w:pPr>
-        <w:shd w:fill="F4F5F6" w:val="clear"/>
-        <w:spacing w:after="0" w:before="0" w:line="240"/>
-        <w:ind w:left="120" w:right="120"/>
-      </w:pPr>
-      <w:r>
-        <w:rPr>
-          <w:rFonts w:ascii="Consolas" w:cs="Consolas" w:eastAsia="Consolas" w:hAnsi="Consolas"/>
-          <w:sz w:val="18"/>
-          <w:szCs w:val="18"/>
-        </w:rPr>
-        <w:t xml:space="preserve">CREATE INDEX idx_customer_full_name ON customer(full_name);</w:t>
-      </w:r>
-    </w:p>
-    <w:p>
-      <w:pPr>
-        <w:shd w:fill="F4F5F6" w:val="clear"/>
-        <w:spacing w:after="0" w:before="0" w:line="240"/>
-        <w:ind w:left="120" w:right="120"/>
-      </w:pPr>
-      <w:r>
-        <w:rPr>
-          <w:rFonts w:ascii="Consolas" w:cs="Consolas" w:eastAsia="Consolas" w:hAnsi="Consolas"/>
-          <w:sz w:val="18"/>
-          <w:szCs w:val="18"/>
-        </w:rPr>
-        <w:t xml:space="preserve">CREATE INDEX idx_customer_tax_id    ON customer(tax_identifier);</w:t>
-      </w:r>
-    </w:p>
-    <w:p>
-      <w:pPr>
-        <w:shd w:fill="F4F5F6" w:val="clear"/>
-        <w:spacing w:after="0" w:before="0" w:line="240"/>
-        <w:ind w:left="120" w:right="120"/>
-      </w:pPr>
-      <w:r>
-        <w:rPr>
-          <w:rFonts w:ascii="Consolas" w:cs="Consolas" w:eastAsia="Consolas" w:hAnsi="Consolas"/>
-          <w:sz w:val="18"/>
-          <w:szCs w:val="18"/>
-        </w:rPr>
-        <w:t xml:space="preserve">CREATE INDEX idx_customer_status    ON customer(customer_status);</w:t>
-      </w:r>
-    </w:p>
-    <w:p>
-      <w:pPr>
-        <w:shd w:fill="F4F5F6" w:val="clear"/>
-        <w:spacing w:after="40" w:before="0" w:line="240"/>
-        <w:ind w:left="120" w:right="120"/>
-      </w:pPr>
-      <w:r>
-        <w:rPr>
-          <w:rFonts w:ascii="Consolas" w:cs="Consolas" w:eastAsia="Consolas" w:hAnsi="Consolas"/>
-          <w:sz w:val="18"/>
-          <w:szCs w:val="18"/>
-        </w:rPr>
-        <w:t xml:space="preserve">CREATE INDEX idx_customer_type      ON customer(customer_type);</w:t>
-      </w:r>
-    </w:p>
-    <w:p>
-      <w:pPr>
-        <w:spacing w:after="80" w:before="40"/>
-      </w:pPr>
-      <w:r>
-        <w:t xml:space="preserve">The SQL Server session store is a </w:t>
-      </w:r>
-      <w:r>
-        <w:rPr>
-          <w:rFonts w:ascii="Consolas" w:cs="Consolas" w:eastAsia="Consolas" w:hAnsi="Consolas"/>
-          <w:sz w:val="20"/>
-          <w:szCs w:val="20"/>
-          <w:shd w:fill="EEF0F2" w:val="clear"/>
-        </w:rPr>
-        <w:t xml:space="preserve">sessions</w:t>
-      </w:r>
-      <w:r>
-        <w:t xml:space="preserve"> table (</w:t>
-      </w:r>
-      <w:r>
-        <w:rPr>
-          <w:rFonts w:ascii="Consolas" w:cs="Consolas" w:eastAsia="Consolas" w:hAnsi="Consolas"/>
-          <w:sz w:val="20"/>
-          <w:szCs w:val="20"/>
-          <w:shd w:fill="EEF0F2" w:val="clear"/>
-        </w:rPr>
-        <w:t xml:space="preserve">session_id</w:t>
-      </w:r>
-      <w:r>
-        <w:t xml:space="preserve">, </w:t>
-      </w:r>
-      <w:r>
-        <w:rPr>
-          <w:rFonts w:ascii="Consolas" w:cs="Consolas" w:eastAsia="Consolas" w:hAnsi="Consolas"/>
-          <w:sz w:val="20"/>
-          <w:szCs w:val="20"/>
-          <w:shd w:fill="EEF0F2" w:val="clear"/>
-        </w:rPr>
-        <w:t xml:space="preserve">session_data</w:t>
-      </w:r>
-      <w:r>
-        <w:t xml:space="preserve">, </w:t>
-      </w:r>
-      <w:r>
-        <w:rPr>
-          <w:rFonts w:ascii="Consolas" w:cs="Consolas" w:eastAsia="Consolas" w:hAnsi="Consolas"/>
-          <w:sz w:val="20"/>
-          <w:szCs w:val="20"/>
-          <w:shd w:fill="EEF0F2" w:val="clear"/>
-        </w:rPr>
-        <w:t xml:space="preserve">expires_at</w:t>
-      </w:r>
-      <w:r>
-        <w:t xml:space="preserve">); expired rows are cleaned up automatically by the application session layer on a short interval.</w:t>
-      </w:r>
-    </w:p>
-    <w:p>
-      <w:pPr>
-        <w:pStyle w:val="Heading3"/>
-      </w:pPr>
-      <w:r>
-        <w:t xml:space="preserve">4.5 Data Loading (Vault / SPOT to App DB)</w:t>
+        <w:t xml:space="preserve">4.4 Data Loading (Vault / SPOT to App DB)</w:t>
       </w:r>
     </w:p>
     <w:p>
@@ -6252,10 +5155,38 @@
     </w:p>
     <w:p>
       <w:pPr>
+        <w:pBdr>
+          <w:bottom w:val="single" w:color="333333" w:sz="6" w:space="1"/>
+        </w:pBdr>
+        <w:spacing w:after="80" w:before="80"/>
+      </w:pPr>
+    </w:p>
+    <w:p>
+      <w:pPr>
+        <w:pStyle w:val="Heading2"/>
+      </w:pPr>
+      <w:r>
+        <w:t xml:space="preserve">5. Technology Stack and Integration Patterns</w:t>
+      </w:r>
+    </w:p>
+    <w:p>
+      <w:pPr>
         <w:pStyle w:val="Heading3"/>
       </w:pPr>
       <w:r>
-        <w:t xml:space="preserve">4.6 Data Retention and Privacy</w:t>
+        <w:t xml:space="preserve">5.1 Technology Stack Specification for FMB</w:t>
+      </w:r>
+    </w:p>
+    <w:p>
+      <w:pPr>
+        <w:spacing w:after="80" w:before="40"/>
+      </w:pPr>
+      <w:r>
+        <w:rPr>
+          <w:b/>
+          <w:bCs/>
+        </w:rPr>
+        <w:t xml:space="preserve">Frontend Technologies:</w:t>
       </w:r>
     </w:p>
     <w:tbl>
@@ -6307,7 +5238,7 @@
                 <w:bCs/>
                 <w:color w:val="FFFFFF"/>
               </w:rPr>
-              <w:t xml:space="preserve">Data Type</w:t>
+              <w:t xml:space="preserve">Category</w:t>
             </w:r>
           </w:p>
         </w:tc>
@@ -6338,7 +5269,7 @@
                 <w:bCs/>
                 <w:color w:val="FFFFFF"/>
               </w:rPr>
-              <w:t xml:space="preserve">Retention</w:t>
+              <w:t xml:space="preserve">Technology</w:t>
             </w:r>
           </w:p>
         </w:tc>
@@ -6369,7 +5300,7 @@
                 <w:bCs/>
                 <w:color w:val="FFFFFF"/>
               </w:rPr>
-              <w:t xml:space="preserve">Deletion Method</w:t>
+              <w:t xml:space="preserve">Version</w:t>
             </w:r>
           </w:p>
         </w:tc>
@@ -6400,7 +5331,7 @@
                 <w:bCs/>
                 <w:color w:val="FFFFFF"/>
               </w:rPr>
-              <w:t xml:space="preserve">Regulatory Basis</w:t>
+              <w:t xml:space="preserve">Purpose</w:t>
             </w:r>
           </w:p>
         </w:tc>
@@ -6427,7 +5358,7 @@
               <w:spacing w:after="0" w:before="0"/>
             </w:pPr>
             <w:r>
-              <w:t xml:space="preserve">Customer PII</w:t>
+              <w:t xml:space="preserve">UI Framework</w:t>
             </w:r>
           </w:p>
         </w:tc>
@@ -6452,7 +5383,7 @@
               <w:spacing w:after="0" w:before="0"/>
             </w:pPr>
             <w:r>
-              <w:t xml:space="preserve">Per policy after account closure</w:t>
+              <w:t xml:space="preserve">React</w:t>
             </w:r>
           </w:p>
         </w:tc>
@@ -6477,7 +5408,7 @@
               <w:spacing w:after="0" w:before="0"/>
             </w:pPr>
             <w:r>
-              <w:t xml:space="preserve">Purge after retention</w:t>
+              <w:t xml:space="preserve">18.x</w:t>
             </w:r>
           </w:p>
         </w:tc>
@@ -6502,7 +5433,7 @@
               <w:spacing w:after="0" w:before="0"/>
             </w:pPr>
             <w:r>
-              <w:t xml:space="preserve">GLBA, state banking laws</w:t>
+              <w:t xml:space="preserve">Component-based UI</w:t>
             </w:r>
           </w:p>
         </w:tc>
@@ -6529,7 +5460,7 @@
               <w:spacing w:after="0" w:before="0"/>
             </w:pPr>
             <w:r>
-              <w:t xml:space="preserve">Account Data</w:t>
+              <w:t xml:space="preserve">Language</w:t>
             </w:r>
           </w:p>
         </w:tc>
@@ -6554,7 +5485,7 @@
               <w:spacing w:after="0" w:before="0"/>
             </w:pPr>
             <w:r>
-              <w:t xml:space="preserve">Per policy after closure</w:t>
+              <w:t xml:space="preserve">TypeScript</w:t>
             </w:r>
           </w:p>
         </w:tc>
@@ -6579,7 +5510,7 @@
               <w:spacing w:after="0" w:before="0"/>
             </w:pPr>
             <w:r>
-              <w:t xml:space="preserve">Archival then purge</w:t>
+              <w:t xml:space="preserve">5.x</w:t>
             </w:r>
           </w:p>
         </w:tc>
@@ -6604,7 +5535,7 @@
               <w:spacing w:after="0" w:before="0"/>
             </w:pPr>
             <w:r>
-              <w:t xml:space="preserve">Reg CC, Reg E, UCC</w:t>
+              <w:t xml:space="preserve">Type-safe development</w:t>
             </w:r>
           </w:p>
         </w:tc>
@@ -6631,7 +5562,7 @@
               <w:spacing w:after="0" w:before="0"/>
             </w:pPr>
             <w:r>
-              <w:t xml:space="preserve">Transactions</w:t>
+              <w:t xml:space="preserve">Build Tool</w:t>
             </w:r>
           </w:p>
         </w:tc>
@@ -6656,7 +5587,7 @@
               <w:spacing w:after="0" w:before="0"/>
             </w:pPr>
             <w:r>
-              <w:t xml:space="preserve">Per policy</w:t>
+              <w:t xml:space="preserve">Vite</w:t>
             </w:r>
           </w:p>
         </w:tc>
@@ -6681,7 +5612,7 @@
               <w:spacing w:after="0" w:before="0"/>
             </w:pPr>
             <w:r>
-              <w:t xml:space="preserve">Archival then purge</w:t>
+              <w:t xml:space="preserve">5.x</w:t>
             </w:r>
           </w:p>
         </w:tc>
@@ -6706,7 +5637,7 @@
               <w:spacing w:after="0" w:before="0"/>
             </w:pPr>
             <w:r>
-              <w:t xml:space="preserve">Regulatory requirements</w:t>
+              <w:t xml:space="preserve">Build and dev server</w:t>
             </w:r>
           </w:p>
         </w:tc>
@@ -6733,7 +5664,7 @@
               <w:spacing w:after="0" w:before="0"/>
             </w:pPr>
             <w:r>
-              <w:t xml:space="preserve">Debit Card Data</w:t>
+              <w:t xml:space="preserve">UI Library</w:t>
             </w:r>
           </w:p>
         </w:tc>
@@ -6758,7 +5689,7 @@
               <w:spacing w:after="0" w:before="0"/>
             </w:pPr>
             <w:r>
-              <w:t xml:space="preserve">Per policy after cancellation</w:t>
+              <w:t xml:space="preserve">Material-UI (MUI)</w:t>
             </w:r>
           </w:p>
         </w:tc>
@@ -6783,7 +5714,7 @@
               <w:spacing w:after="0" w:before="0"/>
             </w:pPr>
             <w:r>
-              <w:t xml:space="preserve">Store last 4 only; purge after retention</w:t>
+              <w:t xml:space="preserve">7.x</w:t>
             </w:r>
           </w:p>
         </w:tc>
@@ -6808,7 +5739,7 @@
               <w:spacing w:after="0" w:before="0"/>
             </w:pPr>
             <w:r>
-              <w:t xml:space="preserve">PCI DSS</w:t>
+              <w:t xml:space="preserve">Enterprise components</w:t>
             </w:r>
           </w:p>
         </w:tc>
@@ -6835,7 +5766,7 @@
               <w:spacing w:after="0" w:before="0"/>
             </w:pPr>
             <w:r>
-              <w:t xml:space="preserve">Audit Logs</w:t>
+              <w:t xml:space="preserve">State Management</w:t>
             </w:r>
           </w:p>
         </w:tc>
@@ -6860,7 +5791,7 @@
               <w:spacing w:after="0" w:before="0"/>
             </w:pPr>
             <w:r>
-              <w:t xml:space="preserve">Long-term (regulatory)</w:t>
+              <w:t xml:space="preserve">TanStack React Query</w:t>
             </w:r>
           </w:p>
         </w:tc>
@@ -6885,7 +5816,7 @@
               <w:spacing w:after="0" w:before="0"/>
             </w:pPr>
             <w:r>
-              <w:t xml:space="preserve">Indexed storage in SQL Server</w:t>
+              <w:t xml:space="preserve">5.x</w:t>
             </w:r>
           </w:p>
         </w:tc>
@@ -6910,7 +5841,7 @@
               <w:spacing w:after="0" w:before="0"/>
             </w:pPr>
             <w:r>
-              <w:t xml:space="preserve">Regulatory requirements</w:t>
+              <w:t xml:space="preserve">Server-state caching</w:t>
             </w:r>
           </w:p>
         </w:tc>
@@ -6937,7 +5868,7 @@
               <w:spacing w:after="0" w:before="0"/>
             </w:pPr>
             <w:r>
-              <w:t xml:space="preserve">Customer Notes</w:t>
+              <w:t xml:space="preserve">Routing</w:t>
             </w:r>
           </w:p>
         </w:tc>
@@ -6962,7 +5893,7 @@
               <w:spacing w:after="0" w:before="0"/>
             </w:pPr>
             <w:r>
-              <w:t xml:space="preserve">Per policy (legal hold)</w:t>
+              <w:t xml:space="preserve">Wouter</w:t>
             </w:r>
           </w:p>
         </w:tc>
@@ -6987,19 +5918,7 @@
               <w:spacing w:after="0" w:before="0"/>
             </w:pPr>
             <w:r>
-              <w:t xml:space="preserve">Soft delete (</w:t>
-            </w:r>
-            <w:r>
-              <w:rPr>
-                <w:rFonts w:ascii="Consolas" w:cs="Consolas" w:eastAsia="Consolas" w:hAnsi="Consolas"/>
-                <w:sz w:val="20"/>
-                <w:szCs w:val="20"/>
-                <w:shd w:fill="EEF0F2" w:val="clear"/>
-              </w:rPr>
-              <w:t xml:space="preserve">is_deleted</w:t>
-            </w:r>
-            <w:r>
-              <w:t xml:space="preserve"> flag)</w:t>
+              <w:t xml:space="preserve">3.x</w:t>
             </w:r>
           </w:p>
         </w:tc>
@@ -7024,7 +5943,7 @@
               <w:spacing w:after="0" w:before="0"/>
             </w:pPr>
             <w:r>
-              <w:t xml:space="preserve">Internal policy</w:t>
+              <w:t xml:space="preserve">SPA routing</w:t>
             </w:r>
           </w:p>
         </w:tc>
@@ -7051,7 +5970,7 @@
               <w:spacing w:after="0" w:before="0"/>
             </w:pPr>
             <w:r>
-              <w:t xml:space="preserve">Session Data</w:t>
+              <w:t xml:space="preserve">Form Handling</w:t>
             </w:r>
           </w:p>
         </w:tc>
@@ -7076,7 +5995,7 @@
               <w:spacing w:after="0" w:before="0"/>
             </w:pPr>
             <w:r>
-              <w:t xml:space="preserve">Standard session duration</w:t>
+              <w:t xml:space="preserve">React Hook Form</w:t>
             </w:r>
           </w:p>
         </w:tc>
@@ -7101,7 +6020,7 @@
               <w:spacing w:after="0" w:before="0"/>
             </w:pPr>
             <w:r>
-              <w:t xml:space="preserve">Automatic cleanup</w:t>
+              <w:t xml:space="preserve">7.x</w:t>
             </w:r>
           </w:p>
         </w:tc>
@@ -7126,7 +6045,109 @@
               <w:spacing w:after="0" w:before="0"/>
             </w:pPr>
             <w:r>
-              <w:t xml:space="preserve">Security policy</w:t>
+              <w:t xml:space="preserve">Performant forms</w:t>
+            </w:r>
+          </w:p>
+        </w:tc>
+      </w:tr>
+      <w:tr>
+        <w:tc>
+          <w:tcPr>
+            <w:tcW w:type="dxa" w:w="2340"/>
+            <w:tcBorders>
+              <w:top w:val="single" w:color="BBBBBB" w:sz="1"/>
+              <w:left w:val="single" w:color="BBBBBB" w:sz="1"/>
+              <w:bottom w:val="single" w:color="BBBBBB" w:sz="1"/>
+              <w:right w:val="single" w:color="BBBBBB" w:sz="1"/>
+            </w:tcBorders>
+            <w:tcMar>
+              <w:top w:type="dxa" w:w="60"/>
+              <w:left w:type="dxa" w:w="110"/>
+              <w:bottom w:type="dxa" w:w="60"/>
+              <w:right w:type="dxa" w:w="110"/>
+            </w:tcMar>
+          </w:tcPr>
+          <w:p>
+            <w:pPr>
+              <w:spacing w:after="0" w:before="0"/>
+            </w:pPr>
+            <w:r>
+              <w:t xml:space="preserve">Validation</w:t>
+            </w:r>
+          </w:p>
+        </w:tc>
+        <w:tc>
+          <w:tcPr>
+            <w:tcW w:type="dxa" w:w="2340"/>
+            <w:tcBorders>
+              <w:top w:val="single" w:color="BBBBBB" w:sz="1"/>
+              <w:left w:val="single" w:color="BBBBBB" w:sz="1"/>
+              <w:bottom w:val="single" w:color="BBBBBB" w:sz="1"/>
+              <w:right w:val="single" w:color="BBBBBB" w:sz="1"/>
+            </w:tcBorders>
+            <w:tcMar>
+              <w:top w:type="dxa" w:w="60"/>
+              <w:left w:type="dxa" w:w="110"/>
+              <w:bottom w:type="dxa" w:w="60"/>
+              <w:right w:type="dxa" w:w="110"/>
+            </w:tcMar>
+          </w:tcPr>
+          <w:p>
+            <w:pPr>
+              <w:spacing w:after="0" w:before="0"/>
+            </w:pPr>
+            <w:r>
+              <w:t xml:space="preserve">Zod</w:t>
+            </w:r>
+          </w:p>
+        </w:tc>
+        <w:tc>
+          <w:tcPr>
+            <w:tcW w:type="dxa" w:w="2340"/>
+            <w:tcBorders>
+              <w:top w:val="single" w:color="BBBBBB" w:sz="1"/>
+              <w:left w:val="single" w:color="BBBBBB" w:sz="1"/>
+              <w:bottom w:val="single" w:color="BBBBBB" w:sz="1"/>
+              <w:right w:val="single" w:color="BBBBBB" w:sz="1"/>
+            </w:tcBorders>
+            <w:tcMar>
+              <w:top w:type="dxa" w:w="60"/>
+              <w:left w:type="dxa" w:w="110"/>
+              <w:bottom w:type="dxa" w:w="60"/>
+              <w:right w:type="dxa" w:w="110"/>
+            </w:tcMar>
+          </w:tcPr>
+          <w:p>
+            <w:pPr>
+              <w:spacing w:after="0" w:before="0"/>
+            </w:pPr>
+            <w:r>
+              <w:t xml:space="preserve">3.x</w:t>
+            </w:r>
+          </w:p>
+        </w:tc>
+        <w:tc>
+          <w:tcPr>
+            <w:tcW w:type="dxa" w:w="2340"/>
+            <w:tcBorders>
+              <w:top w:val="single" w:color="BBBBBB" w:sz="1"/>
+              <w:left w:val="single" w:color="BBBBBB" w:sz="1"/>
+              <w:bottom w:val="single" w:color="BBBBBB" w:sz="1"/>
+              <w:right w:val="single" w:color="BBBBBB" w:sz="1"/>
+            </w:tcBorders>
+            <w:tcMar>
+              <w:top w:type="dxa" w:w="60"/>
+              <w:left w:type="dxa" w:w="110"/>
+              <w:bottom w:type="dxa" w:w="60"/>
+              <w:right w:type="dxa" w:w="110"/>
+            </w:tcMar>
+          </w:tcPr>
+          <w:p>
+            <w:pPr>
+              <w:spacing w:after="0" w:before="0"/>
+            </w:pPr>
+            <w:r>
+              <w:t xml:space="preserve">Schema validation</w:t>
             </w:r>
           </w:p>
         </w:tc>
@@ -7146,160 +6167,7 @@
           <w:b/>
           <w:bCs/>
         </w:rPr>
-        <w:t xml:space="preserve">PII Handling:</w:t>
-      </w:r>
-    </w:p>
-    <w:p>
-      <w:pPr>
-        <w:pStyle w:val="ListParagraph"/>
-        <w:numPr>
-          <w:ilvl w:val="0"/>
-          <w:numId w:val="2"/>
-        </w:numPr>
-        <w:spacing w:after="20" w:before="0"/>
-      </w:pPr>
-      <w:r>
-        <w:rPr>
-          <w:b/>
-          <w:bCs/>
-        </w:rPr>
-        <w:t xml:space="preserve">At Rest:</w:t>
-      </w:r>
-      <w:r>
-        <w:t xml:space="preserve"> SQL Server TDE (Transparent Data Encryption) for database files</w:t>
-      </w:r>
-    </w:p>
-    <w:p>
-      <w:pPr>
-        <w:pStyle w:val="ListParagraph"/>
-        <w:numPr>
-          <w:ilvl w:val="0"/>
-          <w:numId w:val="2"/>
-        </w:numPr>
-        <w:spacing w:after="20" w:before="0"/>
-      </w:pPr>
-      <w:r>
-        <w:rPr>
-          <w:b/>
-          <w:bCs/>
-        </w:rPr>
-        <w:t xml:space="preserve">In Transit:</w:t>
-      </w:r>
-      <w:r>
-        <w:t xml:space="preserve"> TLS 1.3 for all network communication (IIS reverse proxy)</w:t>
-      </w:r>
-    </w:p>
-    <w:p>
-      <w:pPr>
-        <w:pStyle w:val="ListParagraph"/>
-        <w:numPr>
-          <w:ilvl w:val="0"/>
-          <w:numId w:val="2"/>
-        </w:numPr>
-        <w:spacing w:after="20" w:before="0"/>
-      </w:pPr>
-      <w:r>
-        <w:rPr>
-          <w:b/>
-          <w:bCs/>
-        </w:rPr>
-        <w:t xml:space="preserve">In Use:</w:t>
-      </w:r>
-      <w:r>
-        <w:t xml:space="preserve"> PII fields masked in the UI (tax id rendered as </w:t>
-      </w:r>
-      <w:r>
-        <w:rPr>
-          <w:rFonts w:ascii="Consolas" w:cs="Consolas" w:eastAsia="Consolas" w:hAnsi="Consolas"/>
-          <w:sz w:val="20"/>
-          <w:szCs w:val="20"/>
-          <w:shd w:fill="EEF0F2" w:val="clear"/>
-        </w:rPr>
-        <w:t xml:space="preserve">XXX-XX-1234</w:t>
-      </w:r>
-      <w:r>
-        <w:t xml:space="preserve">)</w:t>
-      </w:r>
-    </w:p>
-    <w:p>
-      <w:pPr>
-        <w:pStyle w:val="ListParagraph"/>
-        <w:numPr>
-          <w:ilvl w:val="0"/>
-          <w:numId w:val="2"/>
-        </w:numPr>
-        <w:spacing w:after="20" w:before="0"/>
-      </w:pPr>
-      <w:r>
-        <w:rPr>
-          <w:b/>
-          <w:bCs/>
-        </w:rPr>
-        <w:t xml:space="preserve">In Logs:</w:t>
-      </w:r>
-      <w:r>
-        <w:t xml:space="preserve"> PII fields redacted (never log tax id, account numbers, or passwords)</w:t>
-      </w:r>
-    </w:p>
-    <w:p>
-      <w:pPr>
-        <w:spacing w:after="60"/>
-      </w:pPr>
-    </w:p>
-    <w:p>
-      <w:pPr>
-        <w:pBdr>
-          <w:left w:val="single" w:color="333333" w:sz="18" w:space="8"/>
-        </w:pBdr>
-        <w:shd w:fill="E4E4E4" w:val="clear"/>
-        <w:spacing w:after="80" w:before="80"/>
-        <w:ind w:left="240" w:right="120"/>
-      </w:pPr>
-      <w:r>
-        <w:rPr>
-          <w:b/>
-          <w:bCs/>
-        </w:rPr>
-        <w:t xml:space="preserve">[CONFIRM]</w:t>
-      </w:r>
-      <w:r>
-        <w:t xml:space="preserve"> Exact retention periods per data type against FMB's records-retention schedule.</w:t>
-      </w:r>
-    </w:p>
-    <w:p>
-      <w:pPr>
-        <w:pBdr>
-          <w:bottom w:val="single" w:color="333333" w:sz="6" w:space="1"/>
-        </w:pBdr>
-        <w:spacing w:after="80" w:before="80"/>
-      </w:pPr>
-    </w:p>
-    <w:p>
-      <w:pPr>
-        <w:pStyle w:val="Heading2"/>
-      </w:pPr>
-      <w:r>
-        <w:t xml:space="preserve">5. Technology Stack and Integration Patterns</w:t>
-      </w:r>
-    </w:p>
-    <w:p>
-      <w:pPr>
-        <w:pStyle w:val="Heading3"/>
-      </w:pPr>
-      <w:r>
-        <w:t xml:space="preserve">5.1 Technology Stack Specification for FMB</w:t>
-      </w:r>
-    </w:p>
-    <w:p>
-      <w:pPr>
-        <w:spacing w:after="80" w:before="40"/>
-      </w:pPr>
-      <w:r>
-        <w:rPr>
-          <w:b/>
-          <w:bCs/>
-        </w:rPr>
-        <w:t xml:space="preserve">Frontend Technologies:</w:t>
+        <w:t xml:space="preserve">Backend Technologies:</w:t>
       </w:r>
     </w:p>
     <w:tbl>
@@ -7471,987 +6339,6 @@
               <w:spacing w:after="0" w:before="0"/>
             </w:pPr>
             <w:r>
-              <w:t xml:space="preserve">UI Framework</w:t>
-            </w:r>
-          </w:p>
-        </w:tc>
-        <w:tc>
-          <w:tcPr>
-            <w:tcW w:type="dxa" w:w="2340"/>
-            <w:tcBorders>
-              <w:top w:val="single" w:color="BBBBBB" w:sz="1"/>
-              <w:left w:val="single" w:color="BBBBBB" w:sz="1"/>
-              <w:bottom w:val="single" w:color="BBBBBB" w:sz="1"/>
-              <w:right w:val="single" w:color="BBBBBB" w:sz="1"/>
-            </w:tcBorders>
-            <w:tcMar>
-              <w:top w:type="dxa" w:w="60"/>
-              <w:left w:type="dxa" w:w="110"/>
-              <w:bottom w:type="dxa" w:w="60"/>
-              <w:right w:type="dxa" w:w="110"/>
-            </w:tcMar>
-          </w:tcPr>
-          <w:p>
-            <w:pPr>
-              <w:spacing w:after="0" w:before="0"/>
-            </w:pPr>
-            <w:r>
-              <w:t xml:space="preserve">React</w:t>
-            </w:r>
-          </w:p>
-        </w:tc>
-        <w:tc>
-          <w:tcPr>
-            <w:tcW w:type="dxa" w:w="2340"/>
-            <w:tcBorders>
-              <w:top w:val="single" w:color="BBBBBB" w:sz="1"/>
-              <w:left w:val="single" w:color="BBBBBB" w:sz="1"/>
-              <w:bottom w:val="single" w:color="BBBBBB" w:sz="1"/>
-              <w:right w:val="single" w:color="BBBBBB" w:sz="1"/>
-            </w:tcBorders>
-            <w:tcMar>
-              <w:top w:type="dxa" w:w="60"/>
-              <w:left w:type="dxa" w:w="110"/>
-              <w:bottom w:type="dxa" w:w="60"/>
-              <w:right w:type="dxa" w:w="110"/>
-            </w:tcMar>
-          </w:tcPr>
-          <w:p>
-            <w:pPr>
-              <w:spacing w:after="0" w:before="0"/>
-            </w:pPr>
-            <w:r>
-              <w:t xml:space="preserve">18.x</w:t>
-            </w:r>
-          </w:p>
-        </w:tc>
-        <w:tc>
-          <w:tcPr>
-            <w:tcW w:type="dxa" w:w="2340"/>
-            <w:tcBorders>
-              <w:top w:val="single" w:color="BBBBBB" w:sz="1"/>
-              <w:left w:val="single" w:color="BBBBBB" w:sz="1"/>
-              <w:bottom w:val="single" w:color="BBBBBB" w:sz="1"/>
-              <w:right w:val="single" w:color="BBBBBB" w:sz="1"/>
-            </w:tcBorders>
-            <w:tcMar>
-              <w:top w:type="dxa" w:w="60"/>
-              <w:left w:type="dxa" w:w="110"/>
-              <w:bottom w:type="dxa" w:w="60"/>
-              <w:right w:type="dxa" w:w="110"/>
-            </w:tcMar>
-          </w:tcPr>
-          <w:p>
-            <w:pPr>
-              <w:spacing w:after="0" w:before="0"/>
-            </w:pPr>
-            <w:r>
-              <w:t xml:space="preserve">Component-based UI</w:t>
-            </w:r>
-          </w:p>
-        </w:tc>
-      </w:tr>
-      <w:tr>
-        <w:tc>
-          <w:tcPr>
-            <w:tcW w:type="dxa" w:w="2340"/>
-            <w:tcBorders>
-              <w:top w:val="single" w:color="BBBBBB" w:sz="1"/>
-              <w:left w:val="single" w:color="BBBBBB" w:sz="1"/>
-              <w:bottom w:val="single" w:color="BBBBBB" w:sz="1"/>
-              <w:right w:val="single" w:color="BBBBBB" w:sz="1"/>
-            </w:tcBorders>
-            <w:tcMar>
-              <w:top w:type="dxa" w:w="60"/>
-              <w:left w:type="dxa" w:w="110"/>
-              <w:bottom w:type="dxa" w:w="60"/>
-              <w:right w:type="dxa" w:w="110"/>
-            </w:tcMar>
-          </w:tcPr>
-          <w:p>
-            <w:pPr>
-              <w:spacing w:after="0" w:before="0"/>
-            </w:pPr>
-            <w:r>
-              <w:t xml:space="preserve">Language</w:t>
-            </w:r>
-          </w:p>
-        </w:tc>
-        <w:tc>
-          <w:tcPr>
-            <w:tcW w:type="dxa" w:w="2340"/>
-            <w:tcBorders>
-              <w:top w:val="single" w:color="BBBBBB" w:sz="1"/>
-              <w:left w:val="single" w:color="BBBBBB" w:sz="1"/>
-              <w:bottom w:val="single" w:color="BBBBBB" w:sz="1"/>
-              <w:right w:val="single" w:color="BBBBBB" w:sz="1"/>
-            </w:tcBorders>
-            <w:tcMar>
-              <w:top w:type="dxa" w:w="60"/>
-              <w:left w:type="dxa" w:w="110"/>
-              <w:bottom w:type="dxa" w:w="60"/>
-              <w:right w:type="dxa" w:w="110"/>
-            </w:tcMar>
-          </w:tcPr>
-          <w:p>
-            <w:pPr>
-              <w:spacing w:after="0" w:before="0"/>
-            </w:pPr>
-            <w:r>
-              <w:t xml:space="preserve">TypeScript</w:t>
-            </w:r>
-          </w:p>
-        </w:tc>
-        <w:tc>
-          <w:tcPr>
-            <w:tcW w:type="dxa" w:w="2340"/>
-            <w:tcBorders>
-              <w:top w:val="single" w:color="BBBBBB" w:sz="1"/>
-              <w:left w:val="single" w:color="BBBBBB" w:sz="1"/>
-              <w:bottom w:val="single" w:color="BBBBBB" w:sz="1"/>
-              <w:right w:val="single" w:color="BBBBBB" w:sz="1"/>
-            </w:tcBorders>
-            <w:tcMar>
-              <w:top w:type="dxa" w:w="60"/>
-              <w:left w:type="dxa" w:w="110"/>
-              <w:bottom w:type="dxa" w:w="60"/>
-              <w:right w:type="dxa" w:w="110"/>
-            </w:tcMar>
-          </w:tcPr>
-          <w:p>
-            <w:pPr>
-              <w:spacing w:after="0" w:before="0"/>
-            </w:pPr>
-            <w:r>
-              <w:t xml:space="preserve">5.x</w:t>
-            </w:r>
-          </w:p>
-        </w:tc>
-        <w:tc>
-          <w:tcPr>
-            <w:tcW w:type="dxa" w:w="2340"/>
-            <w:tcBorders>
-              <w:top w:val="single" w:color="BBBBBB" w:sz="1"/>
-              <w:left w:val="single" w:color="BBBBBB" w:sz="1"/>
-              <w:bottom w:val="single" w:color="BBBBBB" w:sz="1"/>
-              <w:right w:val="single" w:color="BBBBBB" w:sz="1"/>
-            </w:tcBorders>
-            <w:tcMar>
-              <w:top w:type="dxa" w:w="60"/>
-              <w:left w:type="dxa" w:w="110"/>
-              <w:bottom w:type="dxa" w:w="60"/>
-              <w:right w:type="dxa" w:w="110"/>
-            </w:tcMar>
-          </w:tcPr>
-          <w:p>
-            <w:pPr>
-              <w:spacing w:after="0" w:before="0"/>
-            </w:pPr>
-            <w:r>
-              <w:t xml:space="preserve">Type-safe development</w:t>
-            </w:r>
-          </w:p>
-        </w:tc>
-      </w:tr>
-      <w:tr>
-        <w:tc>
-          <w:tcPr>
-            <w:tcW w:type="dxa" w:w="2340"/>
-            <w:tcBorders>
-              <w:top w:val="single" w:color="BBBBBB" w:sz="1"/>
-              <w:left w:val="single" w:color="BBBBBB" w:sz="1"/>
-              <w:bottom w:val="single" w:color="BBBBBB" w:sz="1"/>
-              <w:right w:val="single" w:color="BBBBBB" w:sz="1"/>
-            </w:tcBorders>
-            <w:tcMar>
-              <w:top w:type="dxa" w:w="60"/>
-              <w:left w:type="dxa" w:w="110"/>
-              <w:bottom w:type="dxa" w:w="60"/>
-              <w:right w:type="dxa" w:w="110"/>
-            </w:tcMar>
-          </w:tcPr>
-          <w:p>
-            <w:pPr>
-              <w:spacing w:after="0" w:before="0"/>
-            </w:pPr>
-            <w:r>
-              <w:t xml:space="preserve">Build Tool</w:t>
-            </w:r>
-          </w:p>
-        </w:tc>
-        <w:tc>
-          <w:tcPr>
-            <w:tcW w:type="dxa" w:w="2340"/>
-            <w:tcBorders>
-              <w:top w:val="single" w:color="BBBBBB" w:sz="1"/>
-              <w:left w:val="single" w:color="BBBBBB" w:sz="1"/>
-              <w:bottom w:val="single" w:color="BBBBBB" w:sz="1"/>
-              <w:right w:val="single" w:color="BBBBBB" w:sz="1"/>
-            </w:tcBorders>
-            <w:tcMar>
-              <w:top w:type="dxa" w:w="60"/>
-              <w:left w:type="dxa" w:w="110"/>
-              <w:bottom w:type="dxa" w:w="60"/>
-              <w:right w:type="dxa" w:w="110"/>
-            </w:tcMar>
-          </w:tcPr>
-          <w:p>
-            <w:pPr>
-              <w:spacing w:after="0" w:before="0"/>
-            </w:pPr>
-            <w:r>
-              <w:t xml:space="preserve">Vite</w:t>
-            </w:r>
-          </w:p>
-        </w:tc>
-        <w:tc>
-          <w:tcPr>
-            <w:tcW w:type="dxa" w:w="2340"/>
-            <w:tcBorders>
-              <w:top w:val="single" w:color="BBBBBB" w:sz="1"/>
-              <w:left w:val="single" w:color="BBBBBB" w:sz="1"/>
-              <w:bottom w:val="single" w:color="BBBBBB" w:sz="1"/>
-              <w:right w:val="single" w:color="BBBBBB" w:sz="1"/>
-            </w:tcBorders>
-            <w:tcMar>
-              <w:top w:type="dxa" w:w="60"/>
-              <w:left w:type="dxa" w:w="110"/>
-              <w:bottom w:type="dxa" w:w="60"/>
-              <w:right w:type="dxa" w:w="110"/>
-            </w:tcMar>
-          </w:tcPr>
-          <w:p>
-            <w:pPr>
-              <w:spacing w:after="0" w:before="0"/>
-            </w:pPr>
-            <w:r>
-              <w:t xml:space="preserve">5.x</w:t>
-            </w:r>
-          </w:p>
-        </w:tc>
-        <w:tc>
-          <w:tcPr>
-            <w:tcW w:type="dxa" w:w="2340"/>
-            <w:tcBorders>
-              <w:top w:val="single" w:color="BBBBBB" w:sz="1"/>
-              <w:left w:val="single" w:color="BBBBBB" w:sz="1"/>
-              <w:bottom w:val="single" w:color="BBBBBB" w:sz="1"/>
-              <w:right w:val="single" w:color="BBBBBB" w:sz="1"/>
-            </w:tcBorders>
-            <w:tcMar>
-              <w:top w:type="dxa" w:w="60"/>
-              <w:left w:type="dxa" w:w="110"/>
-              <w:bottom w:type="dxa" w:w="60"/>
-              <w:right w:type="dxa" w:w="110"/>
-            </w:tcMar>
-          </w:tcPr>
-          <w:p>
-            <w:pPr>
-              <w:spacing w:after="0" w:before="0"/>
-            </w:pPr>
-            <w:r>
-              <w:t xml:space="preserve">Build and dev server</w:t>
-            </w:r>
-          </w:p>
-        </w:tc>
-      </w:tr>
-      <w:tr>
-        <w:tc>
-          <w:tcPr>
-            <w:tcW w:type="dxa" w:w="2340"/>
-            <w:tcBorders>
-              <w:top w:val="single" w:color="BBBBBB" w:sz="1"/>
-              <w:left w:val="single" w:color="BBBBBB" w:sz="1"/>
-              <w:bottom w:val="single" w:color="BBBBBB" w:sz="1"/>
-              <w:right w:val="single" w:color="BBBBBB" w:sz="1"/>
-            </w:tcBorders>
-            <w:tcMar>
-              <w:top w:type="dxa" w:w="60"/>
-              <w:left w:type="dxa" w:w="110"/>
-              <w:bottom w:type="dxa" w:w="60"/>
-              <w:right w:type="dxa" w:w="110"/>
-            </w:tcMar>
-          </w:tcPr>
-          <w:p>
-            <w:pPr>
-              <w:spacing w:after="0" w:before="0"/>
-            </w:pPr>
-            <w:r>
-              <w:t xml:space="preserve">UI Library</w:t>
-            </w:r>
-          </w:p>
-        </w:tc>
-        <w:tc>
-          <w:tcPr>
-            <w:tcW w:type="dxa" w:w="2340"/>
-            <w:tcBorders>
-              <w:top w:val="single" w:color="BBBBBB" w:sz="1"/>
-              <w:left w:val="single" w:color="BBBBBB" w:sz="1"/>
-              <w:bottom w:val="single" w:color="BBBBBB" w:sz="1"/>
-              <w:right w:val="single" w:color="BBBBBB" w:sz="1"/>
-            </w:tcBorders>
-            <w:tcMar>
-              <w:top w:type="dxa" w:w="60"/>
-              <w:left w:type="dxa" w:w="110"/>
-              <w:bottom w:type="dxa" w:w="60"/>
-              <w:right w:type="dxa" w:w="110"/>
-            </w:tcMar>
-          </w:tcPr>
-          <w:p>
-            <w:pPr>
-              <w:spacing w:after="0" w:before="0"/>
-            </w:pPr>
-            <w:r>
-              <w:t xml:space="preserve">Material-UI (MUI)</w:t>
-            </w:r>
-          </w:p>
-        </w:tc>
-        <w:tc>
-          <w:tcPr>
-            <w:tcW w:type="dxa" w:w="2340"/>
-            <w:tcBorders>
-              <w:top w:val="single" w:color="BBBBBB" w:sz="1"/>
-              <w:left w:val="single" w:color="BBBBBB" w:sz="1"/>
-              <w:bottom w:val="single" w:color="BBBBBB" w:sz="1"/>
-              <w:right w:val="single" w:color="BBBBBB" w:sz="1"/>
-            </w:tcBorders>
-            <w:tcMar>
-              <w:top w:type="dxa" w:w="60"/>
-              <w:left w:type="dxa" w:w="110"/>
-              <w:bottom w:type="dxa" w:w="60"/>
-              <w:right w:type="dxa" w:w="110"/>
-            </w:tcMar>
-          </w:tcPr>
-          <w:p>
-            <w:pPr>
-              <w:spacing w:after="0" w:before="0"/>
-            </w:pPr>
-            <w:r>
-              <w:t xml:space="preserve">7.x</w:t>
-            </w:r>
-          </w:p>
-        </w:tc>
-        <w:tc>
-          <w:tcPr>
-            <w:tcW w:type="dxa" w:w="2340"/>
-            <w:tcBorders>
-              <w:top w:val="single" w:color="BBBBBB" w:sz="1"/>
-              <w:left w:val="single" w:color="BBBBBB" w:sz="1"/>
-              <w:bottom w:val="single" w:color="BBBBBB" w:sz="1"/>
-              <w:right w:val="single" w:color="BBBBBB" w:sz="1"/>
-            </w:tcBorders>
-            <w:tcMar>
-              <w:top w:type="dxa" w:w="60"/>
-              <w:left w:type="dxa" w:w="110"/>
-              <w:bottom w:type="dxa" w:w="60"/>
-              <w:right w:type="dxa" w:w="110"/>
-            </w:tcMar>
-          </w:tcPr>
-          <w:p>
-            <w:pPr>
-              <w:spacing w:after="0" w:before="0"/>
-            </w:pPr>
-            <w:r>
-              <w:t xml:space="preserve">Enterprise components</w:t>
-            </w:r>
-          </w:p>
-        </w:tc>
-      </w:tr>
-      <w:tr>
-        <w:tc>
-          <w:tcPr>
-            <w:tcW w:type="dxa" w:w="2340"/>
-            <w:tcBorders>
-              <w:top w:val="single" w:color="BBBBBB" w:sz="1"/>
-              <w:left w:val="single" w:color="BBBBBB" w:sz="1"/>
-              <w:bottom w:val="single" w:color="BBBBBB" w:sz="1"/>
-              <w:right w:val="single" w:color="BBBBBB" w:sz="1"/>
-            </w:tcBorders>
-            <w:tcMar>
-              <w:top w:type="dxa" w:w="60"/>
-              <w:left w:type="dxa" w:w="110"/>
-              <w:bottom w:type="dxa" w:w="60"/>
-              <w:right w:type="dxa" w:w="110"/>
-            </w:tcMar>
-          </w:tcPr>
-          <w:p>
-            <w:pPr>
-              <w:spacing w:after="0" w:before="0"/>
-            </w:pPr>
-            <w:r>
-              <w:t xml:space="preserve">State Management</w:t>
-            </w:r>
-          </w:p>
-        </w:tc>
-        <w:tc>
-          <w:tcPr>
-            <w:tcW w:type="dxa" w:w="2340"/>
-            <w:tcBorders>
-              <w:top w:val="single" w:color="BBBBBB" w:sz="1"/>
-              <w:left w:val="single" w:color="BBBBBB" w:sz="1"/>
-              <w:bottom w:val="single" w:color="BBBBBB" w:sz="1"/>
-              <w:right w:val="single" w:color="BBBBBB" w:sz="1"/>
-            </w:tcBorders>
-            <w:tcMar>
-              <w:top w:type="dxa" w:w="60"/>
-              <w:left w:type="dxa" w:w="110"/>
-              <w:bottom w:type="dxa" w:w="60"/>
-              <w:right w:type="dxa" w:w="110"/>
-            </w:tcMar>
-          </w:tcPr>
-          <w:p>
-            <w:pPr>
-              <w:spacing w:after="0" w:before="0"/>
-            </w:pPr>
-            <w:r>
-              <w:t xml:space="preserve">TanStack React Query</w:t>
-            </w:r>
-          </w:p>
-        </w:tc>
-        <w:tc>
-          <w:tcPr>
-            <w:tcW w:type="dxa" w:w="2340"/>
-            <w:tcBorders>
-              <w:top w:val="single" w:color="BBBBBB" w:sz="1"/>
-              <w:left w:val="single" w:color="BBBBBB" w:sz="1"/>
-              <w:bottom w:val="single" w:color="BBBBBB" w:sz="1"/>
-              <w:right w:val="single" w:color="BBBBBB" w:sz="1"/>
-            </w:tcBorders>
-            <w:tcMar>
-              <w:top w:type="dxa" w:w="60"/>
-              <w:left w:type="dxa" w:w="110"/>
-              <w:bottom w:type="dxa" w:w="60"/>
-              <w:right w:type="dxa" w:w="110"/>
-            </w:tcMar>
-          </w:tcPr>
-          <w:p>
-            <w:pPr>
-              <w:spacing w:after="0" w:before="0"/>
-            </w:pPr>
-            <w:r>
-              <w:t xml:space="preserve">5.x</w:t>
-            </w:r>
-          </w:p>
-        </w:tc>
-        <w:tc>
-          <w:tcPr>
-            <w:tcW w:type="dxa" w:w="2340"/>
-            <w:tcBorders>
-              <w:top w:val="single" w:color="BBBBBB" w:sz="1"/>
-              <w:left w:val="single" w:color="BBBBBB" w:sz="1"/>
-              <w:bottom w:val="single" w:color="BBBBBB" w:sz="1"/>
-              <w:right w:val="single" w:color="BBBBBB" w:sz="1"/>
-            </w:tcBorders>
-            <w:tcMar>
-              <w:top w:type="dxa" w:w="60"/>
-              <w:left w:type="dxa" w:w="110"/>
-              <w:bottom w:type="dxa" w:w="60"/>
-              <w:right w:type="dxa" w:w="110"/>
-            </w:tcMar>
-          </w:tcPr>
-          <w:p>
-            <w:pPr>
-              <w:spacing w:after="0" w:before="0"/>
-            </w:pPr>
-            <w:r>
-              <w:t xml:space="preserve">Server-state caching</w:t>
-            </w:r>
-          </w:p>
-        </w:tc>
-      </w:tr>
-      <w:tr>
-        <w:tc>
-          <w:tcPr>
-            <w:tcW w:type="dxa" w:w="2340"/>
-            <w:tcBorders>
-              <w:top w:val="single" w:color="BBBBBB" w:sz="1"/>
-              <w:left w:val="single" w:color="BBBBBB" w:sz="1"/>
-              <w:bottom w:val="single" w:color="BBBBBB" w:sz="1"/>
-              <w:right w:val="single" w:color="BBBBBB" w:sz="1"/>
-            </w:tcBorders>
-            <w:tcMar>
-              <w:top w:type="dxa" w:w="60"/>
-              <w:left w:type="dxa" w:w="110"/>
-              <w:bottom w:type="dxa" w:w="60"/>
-              <w:right w:type="dxa" w:w="110"/>
-            </w:tcMar>
-          </w:tcPr>
-          <w:p>
-            <w:pPr>
-              <w:spacing w:after="0" w:before="0"/>
-            </w:pPr>
-            <w:r>
-              <w:t xml:space="preserve">Routing</w:t>
-            </w:r>
-          </w:p>
-        </w:tc>
-        <w:tc>
-          <w:tcPr>
-            <w:tcW w:type="dxa" w:w="2340"/>
-            <w:tcBorders>
-              <w:top w:val="single" w:color="BBBBBB" w:sz="1"/>
-              <w:left w:val="single" w:color="BBBBBB" w:sz="1"/>
-              <w:bottom w:val="single" w:color="BBBBBB" w:sz="1"/>
-              <w:right w:val="single" w:color="BBBBBB" w:sz="1"/>
-            </w:tcBorders>
-            <w:tcMar>
-              <w:top w:type="dxa" w:w="60"/>
-              <w:left w:type="dxa" w:w="110"/>
-              <w:bottom w:type="dxa" w:w="60"/>
-              <w:right w:type="dxa" w:w="110"/>
-            </w:tcMar>
-          </w:tcPr>
-          <w:p>
-            <w:pPr>
-              <w:spacing w:after="0" w:before="0"/>
-            </w:pPr>
-            <w:r>
-              <w:t xml:space="preserve">Wouter</w:t>
-            </w:r>
-          </w:p>
-        </w:tc>
-        <w:tc>
-          <w:tcPr>
-            <w:tcW w:type="dxa" w:w="2340"/>
-            <w:tcBorders>
-              <w:top w:val="single" w:color="BBBBBB" w:sz="1"/>
-              <w:left w:val="single" w:color="BBBBBB" w:sz="1"/>
-              <w:bottom w:val="single" w:color="BBBBBB" w:sz="1"/>
-              <w:right w:val="single" w:color="BBBBBB" w:sz="1"/>
-            </w:tcBorders>
-            <w:tcMar>
-              <w:top w:type="dxa" w:w="60"/>
-              <w:left w:type="dxa" w:w="110"/>
-              <w:bottom w:type="dxa" w:w="60"/>
-              <w:right w:type="dxa" w:w="110"/>
-            </w:tcMar>
-          </w:tcPr>
-          <w:p>
-            <w:pPr>
-              <w:spacing w:after="0" w:before="0"/>
-            </w:pPr>
-            <w:r>
-              <w:t xml:space="preserve">3.x</w:t>
-            </w:r>
-          </w:p>
-        </w:tc>
-        <w:tc>
-          <w:tcPr>
-            <w:tcW w:type="dxa" w:w="2340"/>
-            <w:tcBorders>
-              <w:top w:val="single" w:color="BBBBBB" w:sz="1"/>
-              <w:left w:val="single" w:color="BBBBBB" w:sz="1"/>
-              <w:bottom w:val="single" w:color="BBBBBB" w:sz="1"/>
-              <w:right w:val="single" w:color="BBBBBB" w:sz="1"/>
-            </w:tcBorders>
-            <w:tcMar>
-              <w:top w:type="dxa" w:w="60"/>
-              <w:left w:type="dxa" w:w="110"/>
-              <w:bottom w:type="dxa" w:w="60"/>
-              <w:right w:type="dxa" w:w="110"/>
-            </w:tcMar>
-          </w:tcPr>
-          <w:p>
-            <w:pPr>
-              <w:spacing w:after="0" w:before="0"/>
-            </w:pPr>
-            <w:r>
-              <w:t xml:space="preserve">SPA routing</w:t>
-            </w:r>
-          </w:p>
-        </w:tc>
-      </w:tr>
-      <w:tr>
-        <w:tc>
-          <w:tcPr>
-            <w:tcW w:type="dxa" w:w="2340"/>
-            <w:tcBorders>
-              <w:top w:val="single" w:color="BBBBBB" w:sz="1"/>
-              <w:left w:val="single" w:color="BBBBBB" w:sz="1"/>
-              <w:bottom w:val="single" w:color="BBBBBB" w:sz="1"/>
-              <w:right w:val="single" w:color="BBBBBB" w:sz="1"/>
-            </w:tcBorders>
-            <w:tcMar>
-              <w:top w:type="dxa" w:w="60"/>
-              <w:left w:type="dxa" w:w="110"/>
-              <w:bottom w:type="dxa" w:w="60"/>
-              <w:right w:type="dxa" w:w="110"/>
-            </w:tcMar>
-          </w:tcPr>
-          <w:p>
-            <w:pPr>
-              <w:spacing w:after="0" w:before="0"/>
-            </w:pPr>
-            <w:r>
-              <w:t xml:space="preserve">Form Handling</w:t>
-            </w:r>
-          </w:p>
-        </w:tc>
-        <w:tc>
-          <w:tcPr>
-            <w:tcW w:type="dxa" w:w="2340"/>
-            <w:tcBorders>
-              <w:top w:val="single" w:color="BBBBBB" w:sz="1"/>
-              <w:left w:val="single" w:color="BBBBBB" w:sz="1"/>
-              <w:bottom w:val="single" w:color="BBBBBB" w:sz="1"/>
-              <w:right w:val="single" w:color="BBBBBB" w:sz="1"/>
-            </w:tcBorders>
-            <w:tcMar>
-              <w:top w:type="dxa" w:w="60"/>
-              <w:left w:type="dxa" w:w="110"/>
-              <w:bottom w:type="dxa" w:w="60"/>
-              <w:right w:type="dxa" w:w="110"/>
-            </w:tcMar>
-          </w:tcPr>
-          <w:p>
-            <w:pPr>
-              <w:spacing w:after="0" w:before="0"/>
-            </w:pPr>
-            <w:r>
-              <w:t xml:space="preserve">React Hook Form</w:t>
-            </w:r>
-          </w:p>
-        </w:tc>
-        <w:tc>
-          <w:tcPr>
-            <w:tcW w:type="dxa" w:w="2340"/>
-            <w:tcBorders>
-              <w:top w:val="single" w:color="BBBBBB" w:sz="1"/>
-              <w:left w:val="single" w:color="BBBBBB" w:sz="1"/>
-              <w:bottom w:val="single" w:color="BBBBBB" w:sz="1"/>
-              <w:right w:val="single" w:color="BBBBBB" w:sz="1"/>
-            </w:tcBorders>
-            <w:tcMar>
-              <w:top w:type="dxa" w:w="60"/>
-              <w:left w:type="dxa" w:w="110"/>
-              <w:bottom w:type="dxa" w:w="60"/>
-              <w:right w:type="dxa" w:w="110"/>
-            </w:tcMar>
-          </w:tcPr>
-          <w:p>
-            <w:pPr>
-              <w:spacing w:after="0" w:before="0"/>
-            </w:pPr>
-            <w:r>
-              <w:t xml:space="preserve">7.x</w:t>
-            </w:r>
-          </w:p>
-        </w:tc>
-        <w:tc>
-          <w:tcPr>
-            <w:tcW w:type="dxa" w:w="2340"/>
-            <w:tcBorders>
-              <w:top w:val="single" w:color="BBBBBB" w:sz="1"/>
-              <w:left w:val="single" w:color="BBBBBB" w:sz="1"/>
-              <w:bottom w:val="single" w:color="BBBBBB" w:sz="1"/>
-              <w:right w:val="single" w:color="BBBBBB" w:sz="1"/>
-            </w:tcBorders>
-            <w:tcMar>
-              <w:top w:type="dxa" w:w="60"/>
-              <w:left w:type="dxa" w:w="110"/>
-              <w:bottom w:type="dxa" w:w="60"/>
-              <w:right w:type="dxa" w:w="110"/>
-            </w:tcMar>
-          </w:tcPr>
-          <w:p>
-            <w:pPr>
-              <w:spacing w:after="0" w:before="0"/>
-            </w:pPr>
-            <w:r>
-              <w:t xml:space="preserve">Performant forms</w:t>
-            </w:r>
-          </w:p>
-        </w:tc>
-      </w:tr>
-      <w:tr>
-        <w:tc>
-          <w:tcPr>
-            <w:tcW w:type="dxa" w:w="2340"/>
-            <w:tcBorders>
-              <w:top w:val="single" w:color="BBBBBB" w:sz="1"/>
-              <w:left w:val="single" w:color="BBBBBB" w:sz="1"/>
-              <w:bottom w:val="single" w:color="BBBBBB" w:sz="1"/>
-              <w:right w:val="single" w:color="BBBBBB" w:sz="1"/>
-            </w:tcBorders>
-            <w:tcMar>
-              <w:top w:type="dxa" w:w="60"/>
-              <w:left w:type="dxa" w:w="110"/>
-              <w:bottom w:type="dxa" w:w="60"/>
-              <w:right w:type="dxa" w:w="110"/>
-            </w:tcMar>
-          </w:tcPr>
-          <w:p>
-            <w:pPr>
-              <w:spacing w:after="0" w:before="0"/>
-            </w:pPr>
-            <w:r>
-              <w:t xml:space="preserve">Validation</w:t>
-            </w:r>
-          </w:p>
-        </w:tc>
-        <w:tc>
-          <w:tcPr>
-            <w:tcW w:type="dxa" w:w="2340"/>
-            <w:tcBorders>
-              <w:top w:val="single" w:color="BBBBBB" w:sz="1"/>
-              <w:left w:val="single" w:color="BBBBBB" w:sz="1"/>
-              <w:bottom w:val="single" w:color="BBBBBB" w:sz="1"/>
-              <w:right w:val="single" w:color="BBBBBB" w:sz="1"/>
-            </w:tcBorders>
-            <w:tcMar>
-              <w:top w:type="dxa" w:w="60"/>
-              <w:left w:type="dxa" w:w="110"/>
-              <w:bottom w:type="dxa" w:w="60"/>
-              <w:right w:type="dxa" w:w="110"/>
-            </w:tcMar>
-          </w:tcPr>
-          <w:p>
-            <w:pPr>
-              <w:spacing w:after="0" w:before="0"/>
-            </w:pPr>
-            <w:r>
-              <w:t xml:space="preserve">Zod</w:t>
-            </w:r>
-          </w:p>
-        </w:tc>
-        <w:tc>
-          <w:tcPr>
-            <w:tcW w:type="dxa" w:w="2340"/>
-            <w:tcBorders>
-              <w:top w:val="single" w:color="BBBBBB" w:sz="1"/>
-              <w:left w:val="single" w:color="BBBBBB" w:sz="1"/>
-              <w:bottom w:val="single" w:color="BBBBBB" w:sz="1"/>
-              <w:right w:val="single" w:color="BBBBBB" w:sz="1"/>
-            </w:tcBorders>
-            <w:tcMar>
-              <w:top w:type="dxa" w:w="60"/>
-              <w:left w:type="dxa" w:w="110"/>
-              <w:bottom w:type="dxa" w:w="60"/>
-              <w:right w:type="dxa" w:w="110"/>
-            </w:tcMar>
-          </w:tcPr>
-          <w:p>
-            <w:pPr>
-              <w:spacing w:after="0" w:before="0"/>
-            </w:pPr>
-            <w:r>
-              <w:t xml:space="preserve">3.x</w:t>
-            </w:r>
-          </w:p>
-        </w:tc>
-        <w:tc>
-          <w:tcPr>
-            <w:tcW w:type="dxa" w:w="2340"/>
-            <w:tcBorders>
-              <w:top w:val="single" w:color="BBBBBB" w:sz="1"/>
-              <w:left w:val="single" w:color="BBBBBB" w:sz="1"/>
-              <w:bottom w:val="single" w:color="BBBBBB" w:sz="1"/>
-              <w:right w:val="single" w:color="BBBBBB" w:sz="1"/>
-            </w:tcBorders>
-            <w:tcMar>
-              <w:top w:type="dxa" w:w="60"/>
-              <w:left w:type="dxa" w:w="110"/>
-              <w:bottom w:type="dxa" w:w="60"/>
-              <w:right w:type="dxa" w:w="110"/>
-            </w:tcMar>
-          </w:tcPr>
-          <w:p>
-            <w:pPr>
-              <w:spacing w:after="0" w:before="0"/>
-            </w:pPr>
-            <w:r>
-              <w:t xml:space="preserve">Schema validation</w:t>
-            </w:r>
-          </w:p>
-        </w:tc>
-      </w:tr>
-    </w:tbl>
-    <w:p>
-      <w:pPr>
-        <w:spacing w:after="80"/>
-      </w:pPr>
-    </w:p>
-    <w:p>
-      <w:pPr>
-        <w:spacing w:after="80" w:before="40"/>
-      </w:pPr>
-      <w:r>
-        <w:rPr>
-          <w:b/>
-          <w:bCs/>
-        </w:rPr>
-        <w:t xml:space="preserve">Backend Technologies:</w:t>
-      </w:r>
-    </w:p>
-    <w:tbl>
-      <w:tblPr>
-        <w:tblW w:type="dxa" w:w="9360"/>
-        <w:tblBorders>
-          <w:top w:val="single" w:color="auto" w:sz="4"/>
-          <w:left w:val="single" w:color="auto" w:sz="4"/>
-          <w:bottom w:val="single" w:color="auto" w:sz="4"/>
-          <w:right w:val="single" w:color="auto" w:sz="4"/>
-          <w:insideH w:val="single" w:color="auto" w:sz="4"/>
-          <w:insideV w:val="single" w:color="auto" w:sz="4"/>
-        </w:tblBorders>
-      </w:tblPr>
-      <w:tblGrid>
-        <w:gridCol w:w="2340"/>
-        <w:gridCol w:w="2340"/>
-        <w:gridCol w:w="2340"/>
-        <w:gridCol w:w="2340"/>
-      </w:tblGrid>
-      <w:tr>
-        <w:trPr>
-          <w:tblHeader/>
-        </w:trPr>
-        <w:tc>
-          <w:tcPr>
-            <w:tcW w:type="dxa" w:w="2340"/>
-            <w:tcBorders>
-              <w:top w:val="single" w:color="BBBBBB" w:sz="1"/>
-              <w:left w:val="single" w:color="BBBBBB" w:sz="1"/>
-              <w:bottom w:val="single" w:color="BBBBBB" w:sz="1"/>
-              <w:right w:val="single" w:color="BBBBBB" w:sz="1"/>
-            </w:tcBorders>
-            <w:shd w:fill="333333" w:val="clear"/>
-            <w:tcMar>
-              <w:top w:type="dxa" w:w="60"/>
-              <w:left w:type="dxa" w:w="110"/>
-              <w:bottom w:type="dxa" w:w="60"/>
-              <w:right w:type="dxa" w:w="110"/>
-            </w:tcMar>
-          </w:tcPr>
-          <w:p>
-            <w:pPr>
-              <w:spacing w:after="0" w:before="0"/>
-            </w:pPr>
-            <w:r>
-              <w:rPr>
-                <w:b/>
-                <w:bCs/>
-                <w:color w:val="FFFFFF"/>
-              </w:rPr>
-              <w:t xml:space="preserve">Category</w:t>
-            </w:r>
-          </w:p>
-        </w:tc>
-        <w:tc>
-          <w:tcPr>
-            <w:tcW w:type="dxa" w:w="2340"/>
-            <w:tcBorders>
-              <w:top w:val="single" w:color="BBBBBB" w:sz="1"/>
-              <w:left w:val="single" w:color="BBBBBB" w:sz="1"/>
-              <w:bottom w:val="single" w:color="BBBBBB" w:sz="1"/>
-              <w:right w:val="single" w:color="BBBBBB" w:sz="1"/>
-            </w:tcBorders>
-            <w:shd w:fill="333333" w:val="clear"/>
-            <w:tcMar>
-              <w:top w:type="dxa" w:w="60"/>
-              <w:left w:type="dxa" w:w="110"/>
-              <w:bottom w:type="dxa" w:w="60"/>
-              <w:right w:type="dxa" w:w="110"/>
-            </w:tcMar>
-          </w:tcPr>
-          <w:p>
-            <w:pPr>
-              <w:spacing w:after="0" w:before="0"/>
-            </w:pPr>
-            <w:r>
-              <w:rPr>
-                <w:b/>
-                <w:bCs/>
-                <w:color w:val="FFFFFF"/>
-              </w:rPr>
-              <w:t xml:space="preserve">Technology</w:t>
-            </w:r>
-          </w:p>
-        </w:tc>
-        <w:tc>
-          <w:tcPr>
-            <w:tcW w:type="dxa" w:w="2340"/>
-            <w:tcBorders>
-              <w:top w:val="single" w:color="BBBBBB" w:sz="1"/>
-              <w:left w:val="single" w:color="BBBBBB" w:sz="1"/>
-              <w:bottom w:val="single" w:color="BBBBBB" w:sz="1"/>
-              <w:right w:val="single" w:color="BBBBBB" w:sz="1"/>
-            </w:tcBorders>
-            <w:shd w:fill="333333" w:val="clear"/>
-            <w:tcMar>
-              <w:top w:type="dxa" w:w="60"/>
-              <w:left w:type="dxa" w:w="110"/>
-              <w:bottom w:type="dxa" w:w="60"/>
-              <w:right w:type="dxa" w:w="110"/>
-            </w:tcMar>
-          </w:tcPr>
-          <w:p>
-            <w:pPr>
-              <w:spacing w:after="0" w:before="0"/>
-            </w:pPr>
-            <w:r>
-              <w:rPr>
-                <w:b/>
-                <w:bCs/>
-                <w:color w:val="FFFFFF"/>
-              </w:rPr>
-              <w:t xml:space="preserve">Version</w:t>
-            </w:r>
-          </w:p>
-        </w:tc>
-        <w:tc>
-          <w:tcPr>
-            <w:tcW w:type="dxa" w:w="2340"/>
-            <w:tcBorders>
-              <w:top w:val="single" w:color="BBBBBB" w:sz="1"/>
-              <w:left w:val="single" w:color="BBBBBB" w:sz="1"/>
-              <w:bottom w:val="single" w:color="BBBBBB" w:sz="1"/>
-              <w:right w:val="single" w:color="BBBBBB" w:sz="1"/>
-            </w:tcBorders>
-            <w:shd w:fill="333333" w:val="clear"/>
-            <w:tcMar>
-              <w:top w:type="dxa" w:w="60"/>
-              <w:left w:type="dxa" w:w="110"/>
-              <w:bottom w:type="dxa" w:w="60"/>
-              <w:right w:type="dxa" w:w="110"/>
-            </w:tcMar>
-          </w:tcPr>
-          <w:p>
-            <w:pPr>
-              <w:spacing w:after="0" w:before="0"/>
-            </w:pPr>
-            <w:r>
-              <w:rPr>
-                <w:b/>
-                <w:bCs/>
-                <w:color w:val="FFFFFF"/>
-              </w:rPr>
-              <w:t xml:space="preserve">Purpose</w:t>
-            </w:r>
-          </w:p>
-        </w:tc>
-      </w:tr>
-      <w:tr>
-        <w:tc>
-          <w:tcPr>
-            <w:tcW w:type="dxa" w:w="2340"/>
-            <w:tcBorders>
-              <w:top w:val="single" w:color="BBBBBB" w:sz="1"/>
-              <w:left w:val="single" w:color="BBBBBB" w:sz="1"/>
-              <w:bottom w:val="single" w:color="BBBBBB" w:sz="1"/>
-              <w:right w:val="single" w:color="BBBBBB" w:sz="1"/>
-            </w:tcBorders>
-            <w:tcMar>
-              <w:top w:type="dxa" w:w="60"/>
-              <w:left w:type="dxa" w:w="110"/>
-              <w:bottom w:type="dxa" w:w="60"/>
-              <w:right w:type="dxa" w:w="110"/>
-            </w:tcMar>
-          </w:tcPr>
-          <w:p>
-            <w:pPr>
-              <w:spacing w:after="0" w:before="0"/>
-            </w:pPr>
-            <w:r>
               <w:t xml:space="preserve">Runtime</w:t>
             </w:r>
           </w:p>
@@ -11157,15 +9044,23 @@
     </w:p>
     <w:p>
       <w:pPr>
-        <w:spacing w:after="100" w:before="80"/>
+        <w:spacing w:after="80" w:before="40"/>
+      </w:pPr>
+      <w:r>
+        <w:t xml:space="preserve">Data classification differs by environment: development uses synthetic data, test uses masked / obfuscated data, and preprod and production carry production data (preprod access is restricted to bankers, with RSA SSO enabled).</w:t>
+      </w:r>
+    </w:p>
+    <w:p>
+      <w:pPr>
+        <w:spacing w:after="80" w:before="40"/>
         <w:jc w:val="center"/>
       </w:pPr>
       <w:r>
         <w:drawing>
           <wp:inline distT="0" distB="0" distL="0" distR="0">
-            <wp:extent cx="5905500" cy="1495425"/>
+            <wp:extent cx="6286500" cy="1562100"/>
             <wp:effectExtent t="0" r="0" b="0" l="0"/>
-            <wp:docPr id="1" name="diagram-architecture-5" descr="Mermaid diagram" title="Diagram"/>
+            <wp:docPr id="1" name="img-images-arch-deployment-png" descr="ClientIQ deployment topology across four environments. Development (branch develop, synthetic data), Test (branch test, masked / obfuscated data), and Pre-production (branch preprod, SSO on, production data restricted to bankers) each run a single app server and a standalone SQL Server. Production (branch prod, SSO on, production data) runs an IIS reverse-proxy HA pair fronting two app servers, backed by a SQL Server Always On Availability Group (2 nodes, synchronous commit, automatic failover)." title="ClientIQ deployment topology across four environments. Development (branch develop, synthetic data), Test (branch test, masked / obfuscated data), and Pre-production (branch preprod, SSO on, production data restricted to bankers) each run a single app server and a standalone SQL Server. Production (branch prod, SSO on, production data) runs an IIS reverse-proxy HA pair fronting two app servers, backed by a SQL Server Always On Availability Group (2 nodes, synchronous commit, automatic failover)."/>
             <wp:cNvGraphicFramePr>
               <a:graphicFrameLocks xmlns:a="http://schemas.openxmlformats.org/drawingml/2006/main" noChangeAspect="1"/>
             </wp:cNvGraphicFramePr>
@@ -11188,7 +9083,7 @@
                   <pic:spPr bwMode="auto">
                     <a:xfrm>
                       <a:off x="0" y="0"/>
-                      <a:ext cx="5905500" cy="1495425"/>
+                      <a:ext cx="6286500" cy="1562100"/>
                     </a:xfrm>
                     <a:prstGeom prst="rect">
                       <a:avLst/>
@@ -11226,12 +9121,13 @@
         </w:tblBorders>
       </w:tblPr>
       <w:tblGrid>
-        <w:gridCol w:w="1560"/>
-        <w:gridCol w:w="1560"/>
-        <w:gridCol w:w="1560"/>
-        <w:gridCol w:w="1560"/>
-        <w:gridCol w:w="1560"/>
-        <w:gridCol w:w="1560"/>
+        <w:gridCol w:w="1337"/>
+        <w:gridCol w:w="1337"/>
+        <w:gridCol w:w="1337"/>
+        <w:gridCol w:w="1337"/>
+        <w:gridCol w:w="1337"/>
+        <w:gridCol w:w="1337"/>
+        <w:gridCol w:w="1338"/>
       </w:tblGrid>
       <w:tr>
         <w:trPr>
@@ -11239,7 +9135,7 @@
         </w:trPr>
         <w:tc>
           <w:tcPr>
-            <w:tcW w:type="dxa" w:w="1560"/>
+            <w:tcW w:type="dxa" w:w="1337"/>
             <w:tcBorders>
               <w:top w:val="single" w:color="BBBBBB" w:sz="1"/>
               <w:left w:val="single" w:color="BBBBBB" w:sz="1"/>
@@ -11270,7 +9166,7 @@
         </w:tc>
         <w:tc>
           <w:tcPr>
-            <w:tcW w:type="dxa" w:w="1560"/>
+            <w:tcW w:type="dxa" w:w="1337"/>
             <w:tcBorders>
               <w:top w:val="single" w:color="BBBBBB" w:sz="1"/>
               <w:left w:val="single" w:color="BBBBBB" w:sz="1"/>
@@ -11301,7 +9197,7 @@
         </w:tc>
         <w:tc>
           <w:tcPr>
-            <w:tcW w:type="dxa" w:w="1560"/>
+            <w:tcW w:type="dxa" w:w="1337"/>
             <w:tcBorders>
               <w:top w:val="single" w:color="BBBBBB" w:sz="1"/>
               <w:left w:val="single" w:color="BBBBBB" w:sz="1"/>
@@ -11332,7 +9228,7 @@
         </w:tc>
         <w:tc>
           <w:tcPr>
-            <w:tcW w:type="dxa" w:w="1560"/>
+            <w:tcW w:type="dxa" w:w="1337"/>
             <w:tcBorders>
               <w:top w:val="single" w:color="BBBBBB" w:sz="1"/>
               <w:left w:val="single" w:color="BBBBBB" w:sz="1"/>
@@ -11363,7 +9259,7 @@
         </w:tc>
         <w:tc>
           <w:tcPr>
-            <w:tcW w:type="dxa" w:w="1560"/>
+            <w:tcW w:type="dxa" w:w="1337"/>
             <w:tcBorders>
               <w:top w:val="single" w:color="BBBBBB" w:sz="1"/>
               <w:left w:val="single" w:color="BBBBBB" w:sz="1"/>
@@ -11394,7 +9290,38 @@
         </w:tc>
         <w:tc>
           <w:tcPr>
-            <w:tcW w:type="dxa" w:w="1560"/>
+            <w:tcW w:type="dxa" w:w="1337"/>
+            <w:tcBorders>
+              <w:top w:val="single" w:color="BBBBBB" w:sz="1"/>
+              <w:left w:val="single" w:color="BBBBBB" w:sz="1"/>
+              <w:bottom w:val="single" w:color="BBBBBB" w:sz="1"/>
+              <w:right w:val="single" w:color="BBBBBB" w:sz="1"/>
+            </w:tcBorders>
+            <w:shd w:fill="333333" w:val="clear"/>
+            <w:tcMar>
+              <w:top w:type="dxa" w:w="60"/>
+              <w:left w:type="dxa" w:w="110"/>
+              <w:bottom w:type="dxa" w:w="60"/>
+              <w:right w:type="dxa" w:w="110"/>
+            </w:tcMar>
+          </w:tcPr>
+          <w:p>
+            <w:pPr>
+              <w:spacing w:after="0" w:before="0"/>
+            </w:pPr>
+            <w:r>
+              <w:rPr>
+                <w:b/>
+                <w:bCs/>
+                <w:color w:val="FFFFFF"/>
+              </w:rPr>
+              <w:t xml:space="preserve">Data classification</w:t>
+            </w:r>
+          </w:p>
+        </w:tc>
+        <w:tc>
+          <w:tcPr>
+            <w:tcW w:type="dxa" w:w="1338"/>
             <w:tcBorders>
               <w:top w:val="single" w:color="BBBBBB" w:sz="1"/>
               <w:left w:val="single" w:color="BBBBBB" w:sz="1"/>
@@ -11427,7 +9354,7 @@
       <w:tr>
         <w:tc>
           <w:tcPr>
-            <w:tcW w:type="dxa" w:w="1560"/>
+            <w:tcW w:type="dxa" w:w="1337"/>
             <w:tcBorders>
               <w:top w:val="single" w:color="BBBBBB" w:sz="1"/>
               <w:left w:val="single" w:color="BBBBBB" w:sz="1"/>
@@ -11452,7 +9379,7 @@
         </w:tc>
         <w:tc>
           <w:tcPr>
-            <w:tcW w:type="dxa" w:w="1560"/>
+            <w:tcW w:type="dxa" w:w="1337"/>
             <w:tcBorders>
               <w:top w:val="single" w:color="BBBBBB" w:sz="1"/>
               <w:left w:val="single" w:color="BBBBBB" w:sz="1"/>
@@ -11477,7 +9404,7 @@
         </w:tc>
         <w:tc>
           <w:tcPr>
-            <w:tcW w:type="dxa" w:w="1560"/>
+            <w:tcW w:type="dxa" w:w="1337"/>
             <w:tcBorders>
               <w:top w:val="single" w:color="BBBBBB" w:sz="1"/>
               <w:left w:val="single" w:color="BBBBBB" w:sz="1"/>
@@ -11502,7 +9429,7 @@
         </w:tc>
         <w:tc>
           <w:tcPr>
-            <w:tcW w:type="dxa" w:w="1560"/>
+            <w:tcW w:type="dxa" w:w="1337"/>
             <w:tcBorders>
               <w:top w:val="single" w:color="BBBBBB" w:sz="1"/>
               <w:left w:val="single" w:color="BBBBBB" w:sz="1"/>
@@ -11527,7 +9454,7 @@
         </w:tc>
         <w:tc>
           <w:tcPr>
-            <w:tcW w:type="dxa" w:w="1560"/>
+            <w:tcW w:type="dxa" w:w="1337"/>
             <w:tcBorders>
               <w:top w:val="single" w:color="BBBBBB" w:sz="1"/>
               <w:left w:val="single" w:color="BBBBBB" w:sz="1"/>
@@ -11552,7 +9479,32 @@
         </w:tc>
         <w:tc>
           <w:tcPr>
-            <w:tcW w:type="dxa" w:w="1560"/>
+            <w:tcW w:type="dxa" w:w="1337"/>
+            <w:tcBorders>
+              <w:top w:val="single" w:color="BBBBBB" w:sz="1"/>
+              <w:left w:val="single" w:color="BBBBBB" w:sz="1"/>
+              <w:bottom w:val="single" w:color="BBBBBB" w:sz="1"/>
+              <w:right w:val="single" w:color="BBBBBB" w:sz="1"/>
+            </w:tcBorders>
+            <w:tcMar>
+              <w:top w:type="dxa" w:w="60"/>
+              <w:left w:type="dxa" w:w="110"/>
+              <w:bottom w:type="dxa" w:w="60"/>
+              <w:right w:type="dxa" w:w="110"/>
+            </w:tcMar>
+          </w:tcPr>
+          <w:p>
+            <w:pPr>
+              <w:spacing w:after="0" w:before="0"/>
+            </w:pPr>
+            <w:r>
+              <w:t xml:space="preserve">Synthetic data</w:t>
+            </w:r>
+          </w:p>
+        </w:tc>
+        <w:tc>
+          <w:tcPr>
+            <w:tcW w:type="dxa" w:w="1338"/>
             <w:tcBorders>
               <w:top w:val="single" w:color="BBBBBB" w:sz="1"/>
               <w:left w:val="single" w:color="BBBBBB" w:sz="1"/>
@@ -11579,7 +9531,7 @@
       <w:tr>
         <w:tc>
           <w:tcPr>
-            <w:tcW w:type="dxa" w:w="1560"/>
+            <w:tcW w:type="dxa" w:w="1337"/>
             <w:tcBorders>
               <w:top w:val="single" w:color="BBBBBB" w:sz="1"/>
               <w:left w:val="single" w:color="BBBBBB" w:sz="1"/>
@@ -11604,7 +9556,7 @@
         </w:tc>
         <w:tc>
           <w:tcPr>
-            <w:tcW w:type="dxa" w:w="1560"/>
+            <w:tcW w:type="dxa" w:w="1337"/>
             <w:tcBorders>
               <w:top w:val="single" w:color="BBBBBB" w:sz="1"/>
               <w:left w:val="single" w:color="BBBBBB" w:sz="1"/>
@@ -11629,7 +9581,7 @@
         </w:tc>
         <w:tc>
           <w:tcPr>
-            <w:tcW w:type="dxa" w:w="1560"/>
+            <w:tcW w:type="dxa" w:w="1337"/>
             <w:tcBorders>
               <w:top w:val="single" w:color="BBBBBB" w:sz="1"/>
               <w:left w:val="single" w:color="BBBBBB" w:sz="1"/>
@@ -11654,7 +9606,7 @@
         </w:tc>
         <w:tc>
           <w:tcPr>
-            <w:tcW w:type="dxa" w:w="1560"/>
+            <w:tcW w:type="dxa" w:w="1337"/>
             <w:tcBorders>
               <w:top w:val="single" w:color="BBBBBB" w:sz="1"/>
               <w:left w:val="single" w:color="BBBBBB" w:sz="1"/>
@@ -11679,7 +9631,7 @@
         </w:tc>
         <w:tc>
           <w:tcPr>
-            <w:tcW w:type="dxa" w:w="1560"/>
+            <w:tcW w:type="dxa" w:w="1337"/>
             <w:tcBorders>
               <w:top w:val="single" w:color="BBBBBB" w:sz="1"/>
               <w:left w:val="single" w:color="BBBBBB" w:sz="1"/>
@@ -11704,7 +9656,32 @@
         </w:tc>
         <w:tc>
           <w:tcPr>
-            <w:tcW w:type="dxa" w:w="1560"/>
+            <w:tcW w:type="dxa" w:w="1337"/>
+            <w:tcBorders>
+              <w:top w:val="single" w:color="BBBBBB" w:sz="1"/>
+              <w:left w:val="single" w:color="BBBBBB" w:sz="1"/>
+              <w:bottom w:val="single" w:color="BBBBBB" w:sz="1"/>
+              <w:right w:val="single" w:color="BBBBBB" w:sz="1"/>
+            </w:tcBorders>
+            <w:tcMar>
+              <w:top w:type="dxa" w:w="60"/>
+              <w:left w:type="dxa" w:w="110"/>
+              <w:bottom w:type="dxa" w:w="60"/>
+              <w:right w:type="dxa" w:w="110"/>
+            </w:tcMar>
+          </w:tcPr>
+          <w:p>
+            <w:pPr>
+              <w:spacing w:after="0" w:before="0"/>
+            </w:pPr>
+            <w:r>
+              <w:t xml:space="preserve">Masked / obfuscated data</w:t>
+            </w:r>
+          </w:p>
+        </w:tc>
+        <w:tc>
+          <w:tcPr>
+            <w:tcW w:type="dxa" w:w="1338"/>
             <w:tcBorders>
               <w:top w:val="single" w:color="BBBBBB" w:sz="1"/>
               <w:left w:val="single" w:color="BBBBBB" w:sz="1"/>
@@ -11731,7 +9708,7 @@
       <w:tr>
         <w:tc>
           <w:tcPr>
-            <w:tcW w:type="dxa" w:w="1560"/>
+            <w:tcW w:type="dxa" w:w="1337"/>
             <w:tcBorders>
               <w:top w:val="single" w:color="BBBBBB" w:sz="1"/>
               <w:left w:val="single" w:color="BBBBBB" w:sz="1"/>
@@ -11756,7 +9733,7 @@
         </w:tc>
         <w:tc>
           <w:tcPr>
-            <w:tcW w:type="dxa" w:w="1560"/>
+            <w:tcW w:type="dxa" w:w="1337"/>
             <w:tcBorders>
               <w:top w:val="single" w:color="BBBBBB" w:sz="1"/>
               <w:left w:val="single" w:color="BBBBBB" w:sz="1"/>
@@ -11781,7 +9758,7 @@
         </w:tc>
         <w:tc>
           <w:tcPr>
-            <w:tcW w:type="dxa" w:w="1560"/>
+            <w:tcW w:type="dxa" w:w="1337"/>
             <w:tcBorders>
               <w:top w:val="single" w:color="BBBBBB" w:sz="1"/>
               <w:left w:val="single" w:color="BBBBBB" w:sz="1"/>
@@ -11806,7 +9783,7 @@
         </w:tc>
         <w:tc>
           <w:tcPr>
-            <w:tcW w:type="dxa" w:w="1560"/>
+            <w:tcW w:type="dxa" w:w="1337"/>
             <w:tcBorders>
               <w:top w:val="single" w:color="BBBBBB" w:sz="1"/>
               <w:left w:val="single" w:color="BBBBBB" w:sz="1"/>
@@ -11831,7 +9808,7 @@
         </w:tc>
         <w:tc>
           <w:tcPr>
-            <w:tcW w:type="dxa" w:w="1560"/>
+            <w:tcW w:type="dxa" w:w="1337"/>
             <w:tcBorders>
               <w:top w:val="single" w:color="BBBBBB" w:sz="1"/>
               <w:left w:val="single" w:color="BBBBBB" w:sz="1"/>
@@ -11856,7 +9833,32 @@
         </w:tc>
         <w:tc>
           <w:tcPr>
-            <w:tcW w:type="dxa" w:w="1560"/>
+            <w:tcW w:type="dxa" w:w="1337"/>
+            <w:tcBorders>
+              <w:top w:val="single" w:color="BBBBBB" w:sz="1"/>
+              <w:left w:val="single" w:color="BBBBBB" w:sz="1"/>
+              <w:bottom w:val="single" w:color="BBBBBB" w:sz="1"/>
+              <w:right w:val="single" w:color="BBBBBB" w:sz="1"/>
+            </w:tcBorders>
+            <w:tcMar>
+              <w:top w:type="dxa" w:w="60"/>
+              <w:left w:type="dxa" w:w="110"/>
+              <w:bottom w:type="dxa" w:w="60"/>
+              <w:right w:type="dxa" w:w="110"/>
+            </w:tcMar>
+          </w:tcPr>
+          <w:p>
+            <w:pPr>
+              <w:spacing w:after="0" w:before="0"/>
+            </w:pPr>
+            <w:r>
+              <w:t xml:space="preserve">Production data, bankers only</w:t>
+            </w:r>
+          </w:p>
+        </w:tc>
+        <w:tc>
+          <w:tcPr>
+            <w:tcW w:type="dxa" w:w="1338"/>
             <w:tcBorders>
               <w:top w:val="single" w:color="BBBBBB" w:sz="1"/>
               <w:left w:val="single" w:color="BBBBBB" w:sz="1"/>
@@ -11883,7 +9885,7 @@
       <w:tr>
         <w:tc>
           <w:tcPr>
-            <w:tcW w:type="dxa" w:w="1560"/>
+            <w:tcW w:type="dxa" w:w="1337"/>
             <w:tcBorders>
               <w:top w:val="single" w:color="BBBBBB" w:sz="1"/>
               <w:left w:val="single" w:color="BBBBBB" w:sz="1"/>
@@ -11908,7 +9910,7 @@
         </w:tc>
         <w:tc>
           <w:tcPr>
-            <w:tcW w:type="dxa" w:w="1560"/>
+            <w:tcW w:type="dxa" w:w="1337"/>
             <w:tcBorders>
               <w:top w:val="single" w:color="BBBBBB" w:sz="1"/>
               <w:left w:val="single" w:color="BBBBBB" w:sz="1"/>
@@ -11933,7 +9935,7 @@
         </w:tc>
         <w:tc>
           <w:tcPr>
-            <w:tcW w:type="dxa" w:w="1560"/>
+            <w:tcW w:type="dxa" w:w="1337"/>
             <w:tcBorders>
               <w:top w:val="single" w:color="BBBBBB" w:sz="1"/>
               <w:left w:val="single" w:color="BBBBBB" w:sz="1"/>
@@ -11958,7 +9960,7 @@
         </w:tc>
         <w:tc>
           <w:tcPr>
-            <w:tcW w:type="dxa" w:w="1560"/>
+            <w:tcW w:type="dxa" w:w="1337"/>
             <w:tcBorders>
               <w:top w:val="single" w:color="BBBBBB" w:sz="1"/>
               <w:left w:val="single" w:color="BBBBBB" w:sz="1"/>
@@ -11983,7 +9985,7 @@
         </w:tc>
         <w:tc>
           <w:tcPr>
-            <w:tcW w:type="dxa" w:w="1560"/>
+            <w:tcW w:type="dxa" w:w="1337"/>
             <w:tcBorders>
               <w:top w:val="single" w:color="BBBBBB" w:sz="1"/>
               <w:left w:val="single" w:color="BBBBBB" w:sz="1"/>
@@ -12008,7 +10010,32 @@
         </w:tc>
         <w:tc>
           <w:tcPr>
-            <w:tcW w:type="dxa" w:w="1560"/>
+            <w:tcW w:type="dxa" w:w="1337"/>
+            <w:tcBorders>
+              <w:top w:val="single" w:color="BBBBBB" w:sz="1"/>
+              <w:left w:val="single" w:color="BBBBBB" w:sz="1"/>
+              <w:bottom w:val="single" w:color="BBBBBB" w:sz="1"/>
+              <w:right w:val="single" w:color="BBBBBB" w:sz="1"/>
+            </w:tcBorders>
+            <w:tcMar>
+              <w:top w:type="dxa" w:w="60"/>
+              <w:left w:type="dxa" w:w="110"/>
+              <w:bottom w:type="dxa" w:w="60"/>
+              <w:right w:type="dxa" w:w="110"/>
+            </w:tcMar>
+          </w:tcPr>
+          <w:p>
+            <w:pPr>
+              <w:spacing w:after="0" w:before="0"/>
+            </w:pPr>
+            <w:r>
+              <w:t xml:space="preserve">Production data</w:t>
+            </w:r>
+          </w:p>
+        </w:tc>
+        <w:tc>
+          <w:tcPr>
+            <w:tcW w:type="dxa" w:w="1338"/>
             <w:tcBorders>
               <w:top w:val="single" w:color="BBBBBB" w:sz="1"/>
               <w:left w:val="single" w:color="BBBBBB" w:sz="1"/>
@@ -12313,15 +10340,15 @@
     </w:p>
     <w:p>
       <w:pPr>
-        <w:spacing w:after="100" w:before="80"/>
+        <w:spacing w:after="80" w:before="40"/>
         <w:jc w:val="center"/>
       </w:pPr>
       <w:r>
         <w:drawing>
           <wp:inline distT="0" distB="0" distL="0" distR="0">
-            <wp:extent cx="5905500" cy="6038850"/>
+            <wp:extent cx="6286500" cy="6419850"/>
             <wp:effectExtent t="0" r="0" b="0" l="0"/>
-            <wp:docPr id="1" name="diagram-architecture-6" descr="Mermaid diagram" title="Diagram"/>
+            <wp:docPr id="1" name="img-images-arch-cicd-png" descr="ClientIQ CI/CD pipeline. The build stage (Azure DevOps, on-prem agents) runs npm install, lint, TypeScript type-check, unit tests, and build, with SonarQube SAST on develop. It then promotes through Deploy Dev (branch develop), Deploy Test (branch test, with OWASP ZAP DAST), Deploy PreProd (branch preprod), and Deploy Prod (branch prod, two app servers, Windows Service restart)." title="ClientIQ CI/CD pipeline. The build stage (Azure DevOps, on-prem agents) runs npm install, lint, TypeScript type-check, unit tests, and build, with SonarQube SAST on develop. It then promotes through Deploy Dev (branch develop), Deploy Test (branch test, with OWASP ZAP DAST), Deploy PreProd (branch preprod), and Deploy Prod (branch prod, two app servers, Windows Service restart)."/>
             <wp:cNvGraphicFramePr>
               <a:graphicFrameLocks xmlns:a="http://schemas.openxmlformats.org/drawingml/2006/main" noChangeAspect="1"/>
             </wp:cNvGraphicFramePr>
@@ -12344,7 +10371,7 @@
                   <pic:spPr bwMode="auto">
                     <a:xfrm>
                       <a:off x="0" y="0"/>
-                      <a:ext cx="5905500" cy="6038850"/>
+                      <a:ext cx="6286500" cy="6419850"/>
                     </a:xfrm>
                     <a:prstGeom prst="rect">
                       <a:avLst/>
@@ -12437,15 +10464,15 @@
     </w:p>
     <w:p>
       <w:pPr>
-        <w:spacing w:after="100" w:before="80"/>
+        <w:spacing w:after="80" w:before="40"/>
         <w:jc w:val="center"/>
       </w:pPr>
       <w:r>
         <w:drawing>
           <wp:inline distT="0" distB="0" distL="0" distR="0">
-            <wp:extent cx="5905500" cy="4229100"/>
+            <wp:extent cx="6286500" cy="4495800"/>
             <wp:effectExtent t="0" r="0" b="0" l="0"/>
-            <wp:docPr id="1" name="diagram-architecture-7" descr="Mermaid diagram" title="Diagram"/>
+            <wp:docPr id="1" name="img-images-arch-saml-sequence-png" descr="ClientIQ SAML 2.0 SSO sequence. The browser launches ClientIQ from the RSA SecurID portal; RSA returns a SAML Response (HTTP-POST); the browser posts to /saml/acs, which IIS forwards to the Node app on port 5000; the app validates the assertion (signature, clock skew), regenerates the session, upserts the employee in SQL Server, maps AD groups to role names, performs enforced role sync, loads permissions and ensures the Branch Manager fallback, then redirects the browser to the home page with a clientiq.sid session cookie." title="ClientIQ SAML 2.0 SSO sequence. The browser launches ClientIQ from the RSA SecurID portal; RSA returns a SAML Response (HTTP-POST); the browser posts to /saml/acs, which IIS forwards to the Node app on port 5000; the app validates the assertion (signature, clock skew), regenerates the session, upserts the employee in SQL Server, maps AD groups to role names, performs enforced role sync, loads permissions and ensures the Branch Manager fallback, then redirects the browser to the home page with a clientiq.sid session cookie."/>
             <wp:cNvGraphicFramePr>
               <a:graphicFrameLocks xmlns:a="http://schemas.openxmlformats.org/drawingml/2006/main" noChangeAspect="1"/>
             </wp:cNvGraphicFramePr>
@@ -12468,7 +10495,7 @@
                   <pic:spPr bwMode="auto">
                     <a:xfrm>
                       <a:off x="0" y="0"/>
-                      <a:ext cx="5905500" cy="4229100"/>
+                      <a:ext cx="6286500" cy="4495800"/>
                     </a:xfrm>
                     <a:prstGeom prst="rect">
                       <a:avLst/>

</xml_diff>